<commit_message>
fix(p3): bind nominated 11-file kit to delivery masters
</commit_message>
<xml_diff>
--- a/products-storage/05-ks-bez-vozvrata/04-protokol-vnutrenney-proverki.docx
+++ b/products-storage/05-ks-bez-vozvrata/04-protokol-vnutrenney-proverki.docx
@@ -5,550 +5,971 @@
     <w:p>
       <w:pPr>
         <w:pStyle w:val="Title"/>
-        <w:jc w:val="center"/>
       </w:pPr>
       <w:r>
-        <w:t>ПРОТОКОЛ внутренней проверки комплекта КС</w:t>
-      </w:r>
-    </w:p>
-    <w:p/>
-    <w:p>
-      <w:r>
-        <w:t>ПРОТОКОЛ ВНУТРЕННЕЙ ПРОВЕРКИ</w:t>
+        <w:t>Протокол внутренней проверки комплекта КС</w:t>
       </w:r>
     </w:p>
     <w:p>
+      <w:pPr>
+        <w:spacing w:after="100"/>
+      </w:pPr>
       <w:r>
-        <w:t>комплекта исполнительной документации (КС)</w:t>
-      </w:r>
-    </w:p>
-    <w:p/>
-    <w:p>
-      <w:r>
-        <w:t>Дата проверки: '___' ___________ 20___ г.</w:t>
+        <w:rPr>
+          <w:b w:val="0"/>
+          <w:i w:val="0"/>
+          <w:sz w:val="18"/>
+        </w:rPr>
+        <w:t>Протокол № __________  Дата __________  Отчётный период __________</w:t>
       </w:r>
     </w:p>
     <w:p>
+      <w:pPr>
+        <w:spacing w:after="100"/>
+      </w:pPr>
       <w:r>
-        <w:t>Объект: _________________________________________________________________</w:t>
+        <w:rPr>
+          <w:b w:val="0"/>
+          <w:i w:val="0"/>
+          <w:sz w:val="20"/>
+        </w:rPr>
+        <w:t>Объект / участок ___________________________________________________</w:t>
       </w:r>
     </w:p>
     <w:p>
+      <w:pPr>
+        <w:spacing w:after="100"/>
+      </w:pPr>
       <w:r>
-        <w:t>Договор подряда № _____ от '___' ___________ 20___ г.</w:t>
-      </w:r>
-    </w:p>
-    <w:p/>
-    <w:p>
-      <w:r>
-        <w:t>Проверяющая комиссия в составе:</w:t>
+        <w:rPr>
+          <w:b w:val="0"/>
+          <w:i w:val="0"/>
+          <w:sz w:val="20"/>
+        </w:rPr>
+        <w:t>Договор № __________________  Проверяющий __________________________</w:t>
       </w:r>
     </w:p>
     <w:p>
+      <w:pPr>
+        <w:spacing w:after="100"/>
+      </w:pPr>
       <w:r>
-        <w:t>1. Председатель: _________________________________________________________</w:t>
+        <w:rPr>
+          <w:b w:val="0"/>
+          <w:i w:val="0"/>
+          <w:sz w:val="20"/>
+        </w:rPr>
+        <w:t>КС-2 (перечень номеров) __________________  КС-3 № ____________________</w:t>
       </w:r>
     </w:p>
     <w:p>
+      <w:pPr>
+        <w:spacing w:after="100"/>
+      </w:pPr>
       <w:r>
-        <w:t>2. Член комиссии: ________________________________________________________</w:t>
+        <w:rPr>
+          <w:b w:val="0"/>
+          <w:i w:val="0"/>
+          <w:sz w:val="18"/>
+        </w:rPr>
+        <w:t>Состав приложений — реестр №02 от __________. Проверочный лист №01 от __________.</w:t>
       </w:r>
     </w:p>
     <w:p>
-      <w:r>
-        <w:t>3. Член комиссии: ________________________________________________________</w:t>
-      </w:r>
-    </w:p>
-    <w:p/>
-    <w:p>
-      <w:r>
-        <w:t>Проверяемый комплект: КС-2 № _____ / КС-3 № _____ от '___' ___________ 20___ г.</w:t>
-      </w:r>
-    </w:p>
-    <w:p/>
-    <w:p>
       <w:pPr>
-        <w:pStyle w:val="Heading1"/>
+        <w:pStyle w:val="Heading2"/>
       </w:pPr>
       <w:r>
-        <w:t>Результаты проверки</w:t>
+        <w:t>Замечания и повторная проверка</w:t>
       </w:r>
     </w:p>
     <w:tbl>
       <w:tblPr>
-        <w:tblStyle w:val="TableGrid"/>
         <w:tblW w:type="auto" w:w="0"/>
+        <w:jc w:val="center"/>
+        <w:tblLayout w:type="fixed"/>
         <w:tblLook w:firstColumn="1" w:firstRow="1" w:lastColumn="0" w:lastRow="0" w:noHBand="0" w:noVBand="1" w:val="04A0"/>
       </w:tblPr>
       <w:tblGrid>
-        <w:gridCol w:w="1728"/>
-        <w:gridCol w:w="1728"/>
-        <w:gridCol w:w="1728"/>
-        <w:gridCol w:w="1728"/>
-        <w:gridCol w:w="1728"/>
+        <w:gridCol w:w="964"/>
+        <w:gridCol w:w="3005"/>
+        <w:gridCol w:w="2211"/>
+        <w:gridCol w:w="1247"/>
+        <w:gridCol w:w="2438"/>
       </w:tblGrid>
       <w:tr>
+        <w:trPr>
+          <w:cantSplit/>
+          <w:tblHeader/>
+        </w:trPr>
         <w:tc>
           <w:tcPr>
-            <w:tcW w:type="dxa" w:w="1728"/>
+            <w:tcW w:type="dxa" w:w="964"/>
+            <w:vAlign w:val="center"/>
+            <w:shd w:fill="292C30"/>
+            <w:tcMar>
+              <w:top w:w="80" w:type="dxa"/>
+              <w:left w:w="80" w:type="dxa"/>
+              <w:bottom w:w="80" w:type="dxa"/>
+              <w:right w:w="80" w:type="dxa"/>
+            </w:tcMar>
           </w:tcPr>
           <w:p>
+            <w:pPr>
+              <w:spacing w:after="60" w:before="40" w:line="245" w:lineRule="auto"/>
+            </w:pPr>
             <w:r>
-              <w:t>№</w:t>
+              <w:rPr>
+                <w:rFonts w:ascii="Arial" w:hAnsi="Arial"/>
+                <w:b/>
+                <w:i w:val="0"/>
+                <w:color w:val="FFFFFF"/>
+                <w:sz w:val="18"/>
+              </w:rPr>
+              <w:t>№ / пункт №01</w:t>
             </w:r>
           </w:p>
         </w:tc>
         <w:tc>
           <w:tcPr>
-            <w:tcW w:type="dxa" w:w="1728"/>
+            <w:tcW w:type="dxa" w:w="3005"/>
+            <w:vAlign w:val="center"/>
+            <w:shd w:fill="292C30"/>
+            <w:tcMar>
+              <w:top w:w="80" w:type="dxa"/>
+              <w:left w:w="80" w:type="dxa"/>
+              <w:bottom w:w="80" w:type="dxa"/>
+              <w:right w:w="80" w:type="dxa"/>
+            </w:tcMar>
           </w:tcPr>
           <w:p>
+            <w:pPr>
+              <w:spacing w:after="60" w:before="40" w:line="245" w:lineRule="auto"/>
+            </w:pPr>
             <w:r>
-              <w:t>Пункт проверки</w:t>
+              <w:rPr>
+                <w:rFonts w:ascii="Arial" w:hAnsi="Arial"/>
+                <w:b/>
+                <w:i w:val="0"/>
+                <w:color w:val="FFFFFF"/>
+                <w:sz w:val="18"/>
+              </w:rPr>
+              <w:t>Документ, лист и замечание</w:t>
             </w:r>
           </w:p>
         </w:tc>
         <w:tc>
           <w:tcPr>
-            <w:tcW w:type="dxa" w:w="1728"/>
+            <w:tcW w:type="dxa" w:w="2211"/>
+            <w:vAlign w:val="center"/>
+            <w:shd w:fill="292C30"/>
+            <w:tcMar>
+              <w:top w:w="80" w:type="dxa"/>
+              <w:left w:w="80" w:type="dxa"/>
+              <w:bottom w:w="80" w:type="dxa"/>
+              <w:right w:w="80" w:type="dxa"/>
+            </w:tcMar>
           </w:tcPr>
           <w:p>
+            <w:pPr>
+              <w:spacing w:after="60" w:before="40" w:line="245" w:lineRule="auto"/>
+            </w:pPr>
             <w:r>
-              <w:t>Результат</w:t>
+              <w:rPr>
+                <w:rFonts w:ascii="Arial" w:hAnsi="Arial"/>
+                <w:b/>
+                <w:i w:val="0"/>
+                <w:color w:val="FFFFFF"/>
+                <w:sz w:val="18"/>
+              </w:rPr>
+              <w:t>Действие и ответственный</w:t>
             </w:r>
           </w:p>
         </w:tc>
         <w:tc>
           <w:tcPr>
-            <w:tcW w:type="dxa" w:w="1728"/>
+            <w:tcW w:type="dxa" w:w="1247"/>
+            <w:vAlign w:val="center"/>
+            <w:shd w:fill="292C30"/>
+            <w:tcMar>
+              <w:top w:w="80" w:type="dxa"/>
+              <w:left w:w="80" w:type="dxa"/>
+              <w:bottom w:w="80" w:type="dxa"/>
+              <w:right w:w="80" w:type="dxa"/>
+            </w:tcMar>
           </w:tcPr>
           <w:p>
+            <w:pPr>
+              <w:spacing w:after="60" w:before="40" w:line="245" w:lineRule="auto"/>
+            </w:pPr>
             <w:r>
-              <w:t>Замечание</w:t>
+              <w:rPr>
+                <w:rFonts w:ascii="Arial" w:hAnsi="Arial"/>
+                <w:b/>
+                <w:i w:val="0"/>
+                <w:color w:val="FFFFFF"/>
+                <w:sz w:val="18"/>
+              </w:rPr>
+              <w:t>Срок</w:t>
             </w:r>
           </w:p>
         </w:tc>
         <w:tc>
           <w:tcPr>
-            <w:tcW w:type="dxa" w:w="1728"/>
+            <w:tcW w:type="dxa" w:w="2438"/>
+            <w:vAlign w:val="center"/>
+            <w:shd w:fill="292C30"/>
+            <w:tcMar>
+              <w:top w:w="80" w:type="dxa"/>
+              <w:left w:w="80" w:type="dxa"/>
+              <w:bottom w:w="80" w:type="dxa"/>
+              <w:right w:w="80" w:type="dxa"/>
+            </w:tcMar>
           </w:tcPr>
           <w:p>
+            <w:pPr>
+              <w:spacing w:after="60" w:before="40" w:line="245" w:lineRule="auto"/>
+            </w:pPr>
             <w:r>
-              <w:t>Исполнитель</w:t>
+              <w:rPr>
+                <w:rFonts w:ascii="Arial" w:hAnsi="Arial"/>
+                <w:b/>
+                <w:i w:val="0"/>
+                <w:color w:val="FFFFFF"/>
+                <w:sz w:val="18"/>
+              </w:rPr>
+              <w:t>Повторная проверка: дата, ФИО, результат</w:t>
             </w:r>
           </w:p>
         </w:tc>
       </w:tr>
       <w:tr>
+        <w:trPr>
+          <w:cantSplit/>
+        </w:trPr>
         <w:tc>
           <w:tcPr>
-            <w:tcW w:type="dxa" w:w="1728"/>
+            <w:tcW w:type="dxa" w:w="964"/>
+            <w:vAlign w:val="center"/>
+            <w:shd w:fill="FFFFFF"/>
+            <w:tcMar>
+              <w:top w:w="80" w:type="dxa"/>
+              <w:left w:w="80" w:type="dxa"/>
+              <w:bottom w:w="80" w:type="dxa"/>
+              <w:right w:w="80" w:type="dxa"/>
+            </w:tcMar>
           </w:tcPr>
           <w:p>
+            <w:pPr>
+              <w:spacing w:after="60" w:before="40" w:line="245" w:lineRule="auto"/>
+            </w:pPr>
             <w:r>
+              <w:rPr>
+                <w:rFonts w:ascii="Arial" w:hAnsi="Arial"/>
+                <w:b w:val="0"/>
+                <w:i w:val="0"/>
+                <w:color w:val="292C30"/>
+                <w:sz w:val="18"/>
+              </w:rPr>
               <w:t>1</w:t>
             </w:r>
           </w:p>
         </w:tc>
         <w:tc>
           <w:tcPr>
-            <w:tcW w:type="dxa" w:w="1728"/>
+            <w:tcW w:type="dxa" w:w="3005"/>
+            <w:vAlign w:val="center"/>
+            <w:shd w:fill="FFFFFF"/>
+            <w:tcMar>
+              <w:top w:w="80" w:type="dxa"/>
+              <w:left w:w="80" w:type="dxa"/>
+              <w:bottom w:w="80" w:type="dxa"/>
+              <w:right w:w="80" w:type="dxa"/>
+            </w:tcMar>
           </w:tcPr>
           <w:p>
+            <w:pPr>
+              <w:spacing w:after="60" w:before="40" w:line="245" w:lineRule="auto"/>
+            </w:pPr>
             <w:r>
-              <w:t>Соответствие наименования объекта</w:t>
+              <w:rPr>
+                <w:rFonts w:ascii="Arial" w:hAnsi="Arial"/>
+                <w:b w:val="0"/>
+                <w:i w:val="0"/>
+                <w:color w:val="292C30"/>
+                <w:sz w:val="18"/>
+              </w:rPr>
+              <w:br/>
+              <w:br/>
             </w:r>
           </w:p>
         </w:tc>
         <w:tc>
           <w:tcPr>
-            <w:tcW w:type="dxa" w:w="1728"/>
+            <w:tcW w:type="dxa" w:w="2211"/>
+            <w:vAlign w:val="center"/>
+            <w:shd w:fill="FFFFFF"/>
+            <w:tcMar>
+              <w:top w:w="80" w:type="dxa"/>
+              <w:left w:w="80" w:type="dxa"/>
+              <w:bottom w:w="80" w:type="dxa"/>
+              <w:right w:w="80" w:type="dxa"/>
+            </w:tcMar>
           </w:tcPr>
           <w:p>
-            <w:r/>
+            <w:pPr>
+              <w:spacing w:after="60" w:before="40" w:line="245" w:lineRule="auto"/>
+            </w:pPr>
+            <w:r>
+              <w:rPr>
+                <w:rFonts w:ascii="Arial" w:hAnsi="Arial"/>
+                <w:b w:val="0"/>
+                <w:i w:val="0"/>
+                <w:color w:val="292C30"/>
+                <w:sz w:val="18"/>
+              </w:rPr>
+              <w:br/>
+              <w:br/>
+            </w:r>
           </w:p>
         </w:tc>
         <w:tc>
           <w:tcPr>
-            <w:tcW w:type="dxa" w:w="1728"/>
+            <w:tcW w:type="dxa" w:w="1247"/>
+            <w:vAlign w:val="center"/>
+            <w:shd w:fill="FFFFFF"/>
+            <w:tcMar>
+              <w:top w:w="80" w:type="dxa"/>
+              <w:left w:w="80" w:type="dxa"/>
+              <w:bottom w:w="80" w:type="dxa"/>
+              <w:right w:w="80" w:type="dxa"/>
+            </w:tcMar>
           </w:tcPr>
           <w:p>
-            <w:r/>
+            <w:pPr>
+              <w:spacing w:after="60" w:before="40" w:line="245" w:lineRule="auto"/>
+            </w:pPr>
+            <w:r>
+              <w:rPr>
+                <w:rFonts w:ascii="Arial" w:hAnsi="Arial"/>
+                <w:b w:val="0"/>
+                <w:i w:val="0"/>
+                <w:color w:val="292C30"/>
+                <w:sz w:val="18"/>
+              </w:rPr>
+            </w:r>
           </w:p>
         </w:tc>
         <w:tc>
           <w:tcPr>
-            <w:tcW w:type="dxa" w:w="1728"/>
+            <w:tcW w:type="dxa" w:w="2438"/>
+            <w:vAlign w:val="center"/>
+            <w:shd w:fill="FFFFFF"/>
+            <w:tcMar>
+              <w:top w:w="80" w:type="dxa"/>
+              <w:left w:w="80" w:type="dxa"/>
+              <w:bottom w:w="80" w:type="dxa"/>
+              <w:right w:w="80" w:type="dxa"/>
+            </w:tcMar>
           </w:tcPr>
           <w:p>
-            <w:r/>
+            <w:pPr>
+              <w:spacing w:after="60" w:before="40" w:line="245" w:lineRule="auto"/>
+            </w:pPr>
+            <w:r>
+              <w:rPr>
+                <w:rFonts w:ascii="Arial" w:hAnsi="Arial"/>
+                <w:b w:val="0"/>
+                <w:i w:val="0"/>
+                <w:color w:val="292C30"/>
+                <w:sz w:val="18"/>
+              </w:rPr>
+              <w:br/>
+              <w:br/>
+            </w:r>
           </w:p>
         </w:tc>
       </w:tr>
       <w:tr>
+        <w:trPr>
+          <w:cantSplit/>
+        </w:trPr>
         <w:tc>
           <w:tcPr>
-            <w:tcW w:type="dxa" w:w="1728"/>
+            <w:tcW w:type="dxa" w:w="964"/>
+            <w:vAlign w:val="center"/>
+            <w:shd w:fill="F6F4EF"/>
+            <w:tcMar>
+              <w:top w:w="80" w:type="dxa"/>
+              <w:left w:w="80" w:type="dxa"/>
+              <w:bottom w:w="80" w:type="dxa"/>
+              <w:right w:w="80" w:type="dxa"/>
+            </w:tcMar>
           </w:tcPr>
           <w:p>
+            <w:pPr>
+              <w:spacing w:after="60" w:before="40" w:line="245" w:lineRule="auto"/>
+            </w:pPr>
             <w:r>
+              <w:rPr>
+                <w:rFonts w:ascii="Arial" w:hAnsi="Arial"/>
+                <w:b w:val="0"/>
+                <w:i w:val="0"/>
+                <w:color w:val="292C30"/>
+                <w:sz w:val="18"/>
+              </w:rPr>
               <w:t>2</w:t>
             </w:r>
           </w:p>
         </w:tc>
         <w:tc>
           <w:tcPr>
-            <w:tcW w:type="dxa" w:w="1728"/>
+            <w:tcW w:type="dxa" w:w="3005"/>
+            <w:vAlign w:val="center"/>
+            <w:shd w:fill="F6F4EF"/>
+            <w:tcMar>
+              <w:top w:w="80" w:type="dxa"/>
+              <w:left w:w="80" w:type="dxa"/>
+              <w:bottom w:w="80" w:type="dxa"/>
+              <w:right w:w="80" w:type="dxa"/>
+            </w:tcMar>
           </w:tcPr>
           <w:p>
+            <w:pPr>
+              <w:spacing w:after="60" w:before="40" w:line="245" w:lineRule="auto"/>
+            </w:pPr>
             <w:r>
-              <w:t>Нумерация КС-2 (нет пропусков)</w:t>
+              <w:rPr>
+                <w:rFonts w:ascii="Arial" w:hAnsi="Arial"/>
+                <w:b w:val="0"/>
+                <w:i w:val="0"/>
+                <w:color w:val="292C30"/>
+                <w:sz w:val="18"/>
+              </w:rPr>
+              <w:br/>
+              <w:br/>
             </w:r>
           </w:p>
         </w:tc>
         <w:tc>
           <w:tcPr>
-            <w:tcW w:type="dxa" w:w="1728"/>
+            <w:tcW w:type="dxa" w:w="2211"/>
+            <w:vAlign w:val="center"/>
+            <w:shd w:fill="F6F4EF"/>
+            <w:tcMar>
+              <w:top w:w="80" w:type="dxa"/>
+              <w:left w:w="80" w:type="dxa"/>
+              <w:bottom w:w="80" w:type="dxa"/>
+              <w:right w:w="80" w:type="dxa"/>
+            </w:tcMar>
           </w:tcPr>
           <w:p>
-            <w:r/>
+            <w:pPr>
+              <w:spacing w:after="60" w:before="40" w:line="245" w:lineRule="auto"/>
+            </w:pPr>
+            <w:r>
+              <w:rPr>
+                <w:rFonts w:ascii="Arial" w:hAnsi="Arial"/>
+                <w:b w:val="0"/>
+                <w:i w:val="0"/>
+                <w:color w:val="292C30"/>
+                <w:sz w:val="18"/>
+              </w:rPr>
+              <w:br/>
+              <w:br/>
+            </w:r>
           </w:p>
         </w:tc>
         <w:tc>
           <w:tcPr>
-            <w:tcW w:type="dxa" w:w="1728"/>
+            <w:tcW w:type="dxa" w:w="1247"/>
+            <w:vAlign w:val="center"/>
+            <w:shd w:fill="F6F4EF"/>
+            <w:tcMar>
+              <w:top w:w="80" w:type="dxa"/>
+              <w:left w:w="80" w:type="dxa"/>
+              <w:bottom w:w="80" w:type="dxa"/>
+              <w:right w:w="80" w:type="dxa"/>
+            </w:tcMar>
           </w:tcPr>
           <w:p>
-            <w:r/>
+            <w:pPr>
+              <w:spacing w:after="60" w:before="40" w:line="245" w:lineRule="auto"/>
+            </w:pPr>
+            <w:r>
+              <w:rPr>
+                <w:rFonts w:ascii="Arial" w:hAnsi="Arial"/>
+                <w:b w:val="0"/>
+                <w:i w:val="0"/>
+                <w:color w:val="292C30"/>
+                <w:sz w:val="18"/>
+              </w:rPr>
+            </w:r>
           </w:p>
         </w:tc>
         <w:tc>
           <w:tcPr>
-            <w:tcW w:type="dxa" w:w="1728"/>
+            <w:tcW w:type="dxa" w:w="2438"/>
+            <w:vAlign w:val="center"/>
+            <w:shd w:fill="F6F4EF"/>
+            <w:tcMar>
+              <w:top w:w="80" w:type="dxa"/>
+              <w:left w:w="80" w:type="dxa"/>
+              <w:bottom w:w="80" w:type="dxa"/>
+              <w:right w:w="80" w:type="dxa"/>
+            </w:tcMar>
           </w:tcPr>
           <w:p>
-            <w:r/>
+            <w:pPr>
+              <w:spacing w:after="60" w:before="40" w:line="245" w:lineRule="auto"/>
+            </w:pPr>
+            <w:r>
+              <w:rPr>
+                <w:rFonts w:ascii="Arial" w:hAnsi="Arial"/>
+                <w:b w:val="0"/>
+                <w:i w:val="0"/>
+                <w:color w:val="292C30"/>
+                <w:sz w:val="18"/>
+              </w:rPr>
+              <w:br/>
+              <w:br/>
+            </w:r>
           </w:p>
         </w:tc>
       </w:tr>
       <w:tr>
+        <w:trPr>
+          <w:cantSplit/>
+        </w:trPr>
         <w:tc>
           <w:tcPr>
-            <w:tcW w:type="dxa" w:w="1728"/>
+            <w:tcW w:type="dxa" w:w="964"/>
+            <w:vAlign w:val="center"/>
+            <w:shd w:fill="FFFFFF"/>
+            <w:tcMar>
+              <w:top w:w="80" w:type="dxa"/>
+              <w:left w:w="80" w:type="dxa"/>
+              <w:bottom w:w="80" w:type="dxa"/>
+              <w:right w:w="80" w:type="dxa"/>
+            </w:tcMar>
           </w:tcPr>
           <w:p>
+            <w:pPr>
+              <w:spacing w:after="60" w:before="40" w:line="245" w:lineRule="auto"/>
+            </w:pPr>
             <w:r>
+              <w:rPr>
+                <w:rFonts w:ascii="Arial" w:hAnsi="Arial"/>
+                <w:b w:val="0"/>
+                <w:i w:val="0"/>
+                <w:color w:val="292C30"/>
+                <w:sz w:val="18"/>
+              </w:rPr>
               <w:t>3</w:t>
             </w:r>
           </w:p>
         </w:tc>
         <w:tc>
           <w:tcPr>
-            <w:tcW w:type="dxa" w:w="1728"/>
+            <w:tcW w:type="dxa" w:w="3005"/>
+            <w:vAlign w:val="center"/>
+            <w:shd w:fill="FFFFFF"/>
+            <w:tcMar>
+              <w:top w:w="80" w:type="dxa"/>
+              <w:left w:w="80" w:type="dxa"/>
+              <w:bottom w:w="80" w:type="dxa"/>
+              <w:right w:w="80" w:type="dxa"/>
+            </w:tcMar>
           </w:tcPr>
           <w:p>
+            <w:pPr>
+              <w:spacing w:after="60" w:before="40" w:line="245" w:lineRule="auto"/>
+            </w:pPr>
             <w:r>
-              <w:t>Соответствие сумм КС-2 и КС-3</w:t>
+              <w:rPr>
+                <w:rFonts w:ascii="Arial" w:hAnsi="Arial"/>
+                <w:b w:val="0"/>
+                <w:i w:val="0"/>
+                <w:color w:val="292C30"/>
+                <w:sz w:val="18"/>
+              </w:rPr>
+              <w:br/>
+              <w:br/>
             </w:r>
           </w:p>
         </w:tc>
         <w:tc>
           <w:tcPr>
-            <w:tcW w:type="dxa" w:w="1728"/>
+            <w:tcW w:type="dxa" w:w="2211"/>
+            <w:vAlign w:val="center"/>
+            <w:shd w:fill="FFFFFF"/>
+            <w:tcMar>
+              <w:top w:w="80" w:type="dxa"/>
+              <w:left w:w="80" w:type="dxa"/>
+              <w:bottom w:w="80" w:type="dxa"/>
+              <w:right w:w="80" w:type="dxa"/>
+            </w:tcMar>
           </w:tcPr>
           <w:p>
-            <w:r/>
+            <w:pPr>
+              <w:spacing w:after="60" w:before="40" w:line="245" w:lineRule="auto"/>
+            </w:pPr>
+            <w:r>
+              <w:rPr>
+                <w:rFonts w:ascii="Arial" w:hAnsi="Arial"/>
+                <w:b w:val="0"/>
+                <w:i w:val="0"/>
+                <w:color w:val="292C30"/>
+                <w:sz w:val="18"/>
+              </w:rPr>
+              <w:br/>
+              <w:br/>
+            </w:r>
           </w:p>
         </w:tc>
         <w:tc>
           <w:tcPr>
-            <w:tcW w:type="dxa" w:w="1728"/>
+            <w:tcW w:type="dxa" w:w="1247"/>
+            <w:vAlign w:val="center"/>
+            <w:shd w:fill="FFFFFF"/>
+            <w:tcMar>
+              <w:top w:w="80" w:type="dxa"/>
+              <w:left w:w="80" w:type="dxa"/>
+              <w:bottom w:w="80" w:type="dxa"/>
+              <w:right w:w="80" w:type="dxa"/>
+            </w:tcMar>
           </w:tcPr>
           <w:p>
-            <w:r/>
+            <w:pPr>
+              <w:spacing w:after="60" w:before="40" w:line="245" w:lineRule="auto"/>
+            </w:pPr>
+            <w:r>
+              <w:rPr>
+                <w:rFonts w:ascii="Arial" w:hAnsi="Arial"/>
+                <w:b w:val="0"/>
+                <w:i w:val="0"/>
+                <w:color w:val="292C30"/>
+                <w:sz w:val="18"/>
+              </w:rPr>
+            </w:r>
           </w:p>
         </w:tc>
         <w:tc>
           <w:tcPr>
-            <w:tcW w:type="dxa" w:w="1728"/>
+            <w:tcW w:type="dxa" w:w="2438"/>
+            <w:vAlign w:val="center"/>
+            <w:shd w:fill="FFFFFF"/>
+            <w:tcMar>
+              <w:top w:w="80" w:type="dxa"/>
+              <w:left w:w="80" w:type="dxa"/>
+              <w:bottom w:w="80" w:type="dxa"/>
+              <w:right w:w="80" w:type="dxa"/>
+            </w:tcMar>
           </w:tcPr>
           <w:p>
-            <w:r/>
+            <w:pPr>
+              <w:spacing w:after="60" w:before="40" w:line="245" w:lineRule="auto"/>
+            </w:pPr>
+            <w:r>
+              <w:rPr>
+                <w:rFonts w:ascii="Arial" w:hAnsi="Arial"/>
+                <w:b w:val="0"/>
+                <w:i w:val="0"/>
+                <w:color w:val="292C30"/>
+                <w:sz w:val="18"/>
+              </w:rPr>
+              <w:br/>
+              <w:br/>
+            </w:r>
           </w:p>
         </w:tc>
       </w:tr>
       <w:tr>
+        <w:trPr>
+          <w:cantSplit/>
+        </w:trPr>
         <w:tc>
           <w:tcPr>
-            <w:tcW w:type="dxa" w:w="1728"/>
+            <w:tcW w:type="dxa" w:w="964"/>
+            <w:vAlign w:val="center"/>
+            <w:shd w:fill="F6F4EF"/>
+            <w:tcMar>
+              <w:top w:w="80" w:type="dxa"/>
+              <w:left w:w="80" w:type="dxa"/>
+              <w:bottom w:w="80" w:type="dxa"/>
+              <w:right w:w="80" w:type="dxa"/>
+            </w:tcMar>
           </w:tcPr>
           <w:p>
+            <w:pPr>
+              <w:spacing w:after="60" w:before="40" w:line="245" w:lineRule="auto"/>
+            </w:pPr>
             <w:r>
+              <w:rPr>
+                <w:rFonts w:ascii="Arial" w:hAnsi="Arial"/>
+                <w:b w:val="0"/>
+                <w:i w:val="0"/>
+                <w:color w:val="292C30"/>
+                <w:sz w:val="18"/>
+              </w:rPr>
               <w:t>4</w:t>
             </w:r>
           </w:p>
         </w:tc>
         <w:tc>
           <w:tcPr>
-            <w:tcW w:type="dxa" w:w="1728"/>
+            <w:tcW w:type="dxa" w:w="3005"/>
+            <w:vAlign w:val="center"/>
+            <w:shd w:fill="F6F4EF"/>
+            <w:tcMar>
+              <w:top w:w="80" w:type="dxa"/>
+              <w:left w:w="80" w:type="dxa"/>
+              <w:bottom w:w="80" w:type="dxa"/>
+              <w:right w:w="80" w:type="dxa"/>
+            </w:tcMar>
           </w:tcPr>
           <w:p>
+            <w:pPr>
+              <w:spacing w:after="60" w:before="40" w:line="245" w:lineRule="auto"/>
+            </w:pPr>
             <w:r>
-              <w:t>Наличие всех подписей</w:t>
+              <w:rPr>
+                <w:rFonts w:ascii="Arial" w:hAnsi="Arial"/>
+                <w:b w:val="0"/>
+                <w:i w:val="0"/>
+                <w:color w:val="292C30"/>
+                <w:sz w:val="18"/>
+              </w:rPr>
+              <w:br/>
+              <w:br/>
             </w:r>
           </w:p>
         </w:tc>
         <w:tc>
           <w:tcPr>
-            <w:tcW w:type="dxa" w:w="1728"/>
+            <w:tcW w:type="dxa" w:w="2211"/>
+            <w:vAlign w:val="center"/>
+            <w:shd w:fill="F6F4EF"/>
+            <w:tcMar>
+              <w:top w:w="80" w:type="dxa"/>
+              <w:left w:w="80" w:type="dxa"/>
+              <w:bottom w:w="80" w:type="dxa"/>
+              <w:right w:w="80" w:type="dxa"/>
+            </w:tcMar>
           </w:tcPr>
           <w:p>
-            <w:r/>
-          </w:p>
-        </w:tc>
-        <w:tc>
-          <w:tcPr>
-            <w:tcW w:type="dxa" w:w="1728"/>
-          </w:tcPr>
-          <w:p>
-            <w:r/>
-          </w:p>
-        </w:tc>
-        <w:tc>
-          <w:tcPr>
-            <w:tcW w:type="dxa" w:w="1728"/>
-          </w:tcPr>
-          <w:p>
-            <w:r/>
-          </w:p>
-        </w:tc>
-      </w:tr>
-      <w:tr>
-        <w:tc>
-          <w:tcPr>
-            <w:tcW w:type="dxa" w:w="1728"/>
-          </w:tcPr>
-          <w:p>
+            <w:pPr>
+              <w:spacing w:after="60" w:before="40" w:line="245" w:lineRule="auto"/>
+            </w:pPr>
             <w:r>
-              <w:t>5</w:t>
+              <w:rPr>
+                <w:rFonts w:ascii="Arial" w:hAnsi="Arial"/>
+                <w:b w:val="0"/>
+                <w:i w:val="0"/>
+                <w:color w:val="292C30"/>
+                <w:sz w:val="18"/>
+              </w:rPr>
+              <w:br/>
+              <w:br/>
             </w:r>
           </w:p>
         </w:tc>
         <w:tc>
           <w:tcPr>
-            <w:tcW w:type="dxa" w:w="1728"/>
+            <w:tcW w:type="dxa" w:w="1247"/>
+            <w:vAlign w:val="center"/>
+            <w:shd w:fill="F6F4EF"/>
+            <w:tcMar>
+              <w:top w:w="80" w:type="dxa"/>
+              <w:left w:w="80" w:type="dxa"/>
+              <w:bottom w:w="80" w:type="dxa"/>
+              <w:right w:w="80" w:type="dxa"/>
+            </w:tcMar>
           </w:tcPr>
           <w:p>
+            <w:pPr>
+              <w:spacing w:after="60" w:before="40" w:line="245" w:lineRule="auto"/>
+            </w:pPr>
             <w:r>
-              <w:t>Полнота приложений</w:t>
+              <w:rPr>
+                <w:rFonts w:ascii="Arial" w:hAnsi="Arial"/>
+                <w:b w:val="0"/>
+                <w:i w:val="0"/>
+                <w:color w:val="292C30"/>
+                <w:sz w:val="18"/>
+              </w:rPr>
             </w:r>
           </w:p>
         </w:tc>
         <w:tc>
           <w:tcPr>
-            <w:tcW w:type="dxa" w:w="1728"/>
+            <w:tcW w:type="dxa" w:w="2438"/>
+            <w:vAlign w:val="center"/>
+            <w:shd w:fill="F6F4EF"/>
+            <w:tcMar>
+              <w:top w:w="80" w:type="dxa"/>
+              <w:left w:w="80" w:type="dxa"/>
+              <w:bottom w:w="80" w:type="dxa"/>
+              <w:right w:w="80" w:type="dxa"/>
+            </w:tcMar>
           </w:tcPr>
           <w:p>
-            <w:r/>
-          </w:p>
-        </w:tc>
-        <w:tc>
-          <w:tcPr>
-            <w:tcW w:type="dxa" w:w="1728"/>
-          </w:tcPr>
-          <w:p>
-            <w:r/>
-          </w:p>
-        </w:tc>
-        <w:tc>
-          <w:tcPr>
-            <w:tcW w:type="dxa" w:w="1728"/>
-          </w:tcPr>
-          <w:p>
-            <w:r/>
-          </w:p>
-        </w:tc>
-      </w:tr>
-      <w:tr>
-        <w:tc>
-          <w:tcPr>
-            <w:tcW w:type="dxa" w:w="1728"/>
-          </w:tcPr>
-          <w:p>
+            <w:pPr>
+              <w:spacing w:after="60" w:before="40" w:line="245" w:lineRule="auto"/>
+            </w:pPr>
             <w:r>
-              <w:t>6</w:t>
+              <w:rPr>
+                <w:rFonts w:ascii="Arial" w:hAnsi="Arial"/>
+                <w:b w:val="0"/>
+                <w:i w:val="0"/>
+                <w:color w:val="292C30"/>
+                <w:sz w:val="18"/>
+              </w:rPr>
+              <w:br/>
+              <w:br/>
             </w:r>
-          </w:p>
-        </w:tc>
-        <w:tc>
-          <w:tcPr>
-            <w:tcW w:type="dxa" w:w="1728"/>
-          </w:tcPr>
-          <w:p>
-            <w:r>
-              <w:t>Действительность сертификатов</w:t>
-            </w:r>
-          </w:p>
-        </w:tc>
-        <w:tc>
-          <w:tcPr>
-            <w:tcW w:type="dxa" w:w="1728"/>
-          </w:tcPr>
-          <w:p>
-            <w:r/>
-          </w:p>
-        </w:tc>
-        <w:tc>
-          <w:tcPr>
-            <w:tcW w:type="dxa" w:w="1728"/>
-          </w:tcPr>
-          <w:p>
-            <w:r/>
-          </w:p>
-        </w:tc>
-        <w:tc>
-          <w:tcPr>
-            <w:tcW w:type="dxa" w:w="1728"/>
-          </w:tcPr>
-          <w:p>
-            <w:r/>
-          </w:p>
-        </w:tc>
-      </w:tr>
-      <w:tr>
-        <w:tc>
-          <w:tcPr>
-            <w:tcW w:type="dxa" w:w="1728"/>
-          </w:tcPr>
-          <w:p>
-            <w:r>
-              <w:t>7</w:t>
-            </w:r>
-          </w:p>
-        </w:tc>
-        <w:tc>
-          <w:tcPr>
-            <w:tcW w:type="dxa" w:w="1728"/>
-          </w:tcPr>
-          <w:p>
-            <w:r>
-              <w:t>Соответствие исполнительных схем</w:t>
-            </w:r>
-          </w:p>
-        </w:tc>
-        <w:tc>
-          <w:tcPr>
-            <w:tcW w:type="dxa" w:w="1728"/>
-          </w:tcPr>
-          <w:p>
-            <w:r/>
-          </w:p>
-        </w:tc>
-        <w:tc>
-          <w:tcPr>
-            <w:tcW w:type="dxa" w:w="1728"/>
-          </w:tcPr>
-          <w:p>
-            <w:r/>
-          </w:p>
-        </w:tc>
-        <w:tc>
-          <w:tcPr>
-            <w:tcW w:type="dxa" w:w="1728"/>
-          </w:tcPr>
-          <w:p>
-            <w:r/>
-          </w:p>
-        </w:tc>
-      </w:tr>
-      <w:tr>
-        <w:tc>
-          <w:tcPr>
-            <w:tcW w:type="dxa" w:w="1728"/>
-          </w:tcPr>
-          <w:p>
-            <w:r>
-              <w:t>8</w:t>
-            </w:r>
-          </w:p>
-        </w:tc>
-        <w:tc>
-          <w:tcPr>
-            <w:tcW w:type="dxa" w:w="1728"/>
-          </w:tcPr>
-          <w:p>
-            <w:r>
-              <w:t>Акты скрытых работ (полнота, подписи)</w:t>
-            </w:r>
-          </w:p>
-        </w:tc>
-        <w:tc>
-          <w:tcPr>
-            <w:tcW w:type="dxa" w:w="1728"/>
-          </w:tcPr>
-          <w:p>
-            <w:r/>
-          </w:p>
-        </w:tc>
-        <w:tc>
-          <w:tcPr>
-            <w:tcW w:type="dxa" w:w="1728"/>
-          </w:tcPr>
-          <w:p>
-            <w:r/>
-          </w:p>
-        </w:tc>
-        <w:tc>
-          <w:tcPr>
-            <w:tcW w:type="dxa" w:w="1728"/>
-          </w:tcPr>
-          <w:p>
-            <w:r/>
           </w:p>
         </w:tc>
       </w:tr>
     </w:tbl>
-    <w:p/>
-    <w:p/>
     <w:p>
+      <w:pPr>
+        <w:spacing w:after="100"/>
+      </w:pPr>
       <w:r>
-        <w:t>ЗАКЛЮЧЕНИЕ КОМИССИИ:</w:t>
+        <w:rPr>
+          <w:b w:val="0"/>
+          <w:i w:val="0"/>
+          <w:sz w:val="18"/>
+        </w:rPr>
+        <w:t>Для каждого замечания сохраните ссылку на исправленный документ. При нехватке места продолжите таблицу с общей нумерацией.</w:t>
       </w:r>
     </w:p>
     <w:p>
+      <w:pPr>
+        <w:pStyle w:val="Heading2"/>
+      </w:pPr>
       <w:r>
-        <w:t>☐ Комплект соответствует требованиям, к передаче заказчику разрешается.</w:t>
+        <w:t>Решение по комплекту</w:t>
       </w:r>
     </w:p>
     <w:p>
+      <w:pPr>
+        <w:spacing w:after="100"/>
+      </w:pPr>
       <w:r>
-        <w:t>☐ Комплект содержит замечания, требуется доработка (см. таблицу).</w:t>
-      </w:r>
-    </w:p>
-    <w:p/>
-    <w:p>
-      <w:r>
-        <w:t>Председатель комиссии _________________ / _________________________ /</w:t>
+        <w:rPr>
+          <w:b w:val="0"/>
+          <w:i w:val="0"/>
+          <w:sz w:val="20"/>
+        </w:rPr>
+        <w:t>Открытых замечаний: ______. Результат реестра №02: ____________________</w:t>
       </w:r>
     </w:p>
     <w:p>
+      <w:pPr>
+        <w:spacing w:after="100"/>
+      </w:pPr>
       <w:r>
-        <w:t>Члены комиссии         _________________ / _________________________ /</w:t>
+        <w:rPr>
+          <w:b w:val="0"/>
+          <w:i w:val="0"/>
+          <w:sz w:val="20"/>
+        </w:rPr>
+        <w:t>□ Готов к передаче: обязательные приложения проверены, замечания закрыты.</w:t>
+        <w:br/>
+        <w:t>□ Доработать: передача на приёмку после устранения указанных замечаний.</w:t>
       </w:r>
     </w:p>
     <w:p>
+      <w:pPr>
+        <w:spacing w:after="100"/>
+      </w:pPr>
       <w:r>
-        <w:t xml:space="preserve">                       _________________ / _________________________ /</w:t>
+        <w:rPr>
+          <w:b w:val="0"/>
+          <w:i w:val="0"/>
+          <w:sz w:val="20"/>
+        </w:rPr>
+        <w:t>Ответственный за передачу __________________  Плановая дата __________</w:t>
+      </w:r>
+    </w:p>
+    <w:p>
+      <w:pPr>
+        <w:spacing w:after="100"/>
+      </w:pPr>
+      <w:r>
+        <w:rPr>
+          <w:b w:val="0"/>
+          <w:i w:val="0"/>
+          <w:sz w:val="20"/>
+        </w:rPr>
+        <w:t>Проверяющий __________________ / __________________ /  Дата __________</w:t>
+      </w:r>
+    </w:p>
+    <w:p>
+      <w:pPr>
+        <w:spacing w:after="100"/>
+      </w:pPr>
+      <w:r>
+        <w:rPr>
+          <w:b w:val="0"/>
+          <w:i w:val="0"/>
+          <w:sz w:val="20"/>
+        </w:rPr>
+        <w:t>Повторно принято __________________ / __________________ /  Дата ______</w:t>
       </w:r>
     </w:p>
     <w:sectPr>
-      <w:pgSz w:w="12240" w:h="15840"/>
-      <w:pgMar w:top="1440" w:right="1800" w:bottom="1440" w:left="1800" w:header="720" w:footer="720" w:gutter="0"/>
+      <w:headerReference w:type="default" r:id="rId9"/>
+      <w:footerReference w:type="default" r:id="rId10"/>
+      <w:pgSz w:w="11906" w:h="16838"/>
+      <w:pgMar w:top="964" w:right="1020" w:bottom="907" w:left="1020" w:header="397" w:footer="454" w:gutter="0"/>
       <w:cols w:space="720"/>
       <w:docGrid w:linePitch="360"/>
     </w:sectPr>
   </w:body>
 </w:document>
+</file>
+
+<file path=word/footer1.xml><?xml version="1.0" encoding="utf-8"?>
+<w:ftr xmlns:m="http://schemas.openxmlformats.org/officeDocument/2006/math" xmlns:mc="http://schemas.openxmlformats.org/markup-compatibility/2006" xmlns:mo="http://schemas.microsoft.com/office/mac/office/2008/main" xmlns:mv="urn:schemas-microsoft-com:mac:vml" xmlns:o="urn:schemas-microsoft-com:office:office" xmlns:r="http://schemas.openxmlformats.org/officeDocument/2006/relationships" xmlns:v="urn:schemas-microsoft-com:vml" xmlns:w10="urn:schemas-microsoft-com:office:word" xmlns:w14="http://schemas.microsoft.com/office/word/2010/wordml" xmlns:w="http://schemas.openxmlformats.org/wordprocessingml/2006/main" xmlns:wne="http://schemas.microsoft.com/office/word/2006/wordml" xmlns:wp14="http://schemas.microsoft.com/office/word/2010/wordprocessingDrawing" xmlns:wp="http://schemas.openxmlformats.org/drawingml/2006/wordprocessingDrawing" xmlns:wpc="http://schemas.microsoft.com/office/word/2010/wordprocessingCanvas" xmlns:wpg="http://schemas.microsoft.com/office/word/2010/wordprocessingGroup" xmlns:wpi="http://schemas.microsoft.com/office/word/2010/wordprocessingInk" xmlns:wps="http://schemas.microsoft.com/office/word/2010/wordprocessingShape" mc:Ignorable="w14 wp14">
+  <w:p>
+    <w:pPr>
+      <w:pStyle w:val="Footer"/>
+    </w:pPr>
+    <w:r>
+      <w:rPr>
+        <w:b w:val="0"/>
+        <w:i w:val="0"/>
+        <w:sz w:val="16"/>
+      </w:rPr>
+      <w:t xml:space="preserve">КС-2 / КС-3 • Протокол    |    </w:t>
+    </w:r>
+    <w:fldSimple w:instr="PAGE"/>
+  </w:p>
+</w:ftr>
+</file>
+
+<file path=word/header1.xml><?xml version="1.0" encoding="utf-8"?>
+<w:hdr xmlns:m="http://schemas.openxmlformats.org/officeDocument/2006/math" xmlns:mc="http://schemas.openxmlformats.org/markup-compatibility/2006" xmlns:mo="http://schemas.microsoft.com/office/mac/office/2008/main" xmlns:mv="urn:schemas-microsoft-com:mac:vml" xmlns:o="urn:schemas-microsoft-com:office:office" xmlns:r="http://schemas.openxmlformats.org/officeDocument/2006/relationships" xmlns:v="urn:schemas-microsoft-com:vml" xmlns:w10="urn:schemas-microsoft-com:office:word" xmlns:w14="http://schemas.microsoft.com/office/word/2010/wordml" xmlns:w="http://schemas.openxmlformats.org/wordprocessingml/2006/main" xmlns:wne="http://schemas.microsoft.com/office/word/2006/wordml" xmlns:wp14="http://schemas.microsoft.com/office/word/2010/wordprocessingDrawing" xmlns:wp="http://schemas.openxmlformats.org/drawingml/2006/wordprocessingDrawing" xmlns:wpc="http://schemas.microsoft.com/office/word/2010/wordprocessingCanvas" xmlns:wpg="http://schemas.microsoft.com/office/word/2010/wordprocessingGroup" xmlns:wpi="http://schemas.microsoft.com/office/word/2010/wordprocessingInk" xmlns:wps="http://schemas.microsoft.com/office/word/2010/wordprocessingShape" mc:Ignorable="w14 wp14">
+  <w:p>
+    <w:pPr>
+      <w:pStyle w:val="Header"/>
+      <w:pBdr>
+        <w:bottom w:val="single" w:sz="9" w:color="AC9568" w:space="4"/>
+      </w:pBdr>
+    </w:pPr>
+    <w:r>
+      <w:rPr>
+        <w:b/>
+        <w:i w:val="0"/>
+        <w:sz w:val="16"/>
+      </w:rPr>
+      <w:t>МАРЖА В БЕТОНЕ  /  P3</w:t>
+    </w:r>
+  </w:p>
+</w:hdr>
 </file>
 
 <file path=word/numbering.xml><?xml version="1.0" encoding="utf-8"?>
@@ -914,6 +1335,15 @@
     <w:name w:val="Normal"/>
     <w:qFormat/>
     <w:rsid w:val="00FC693F"/>
+    <w:pPr>
+      <w:spacing w:line="254" w:lineRule="auto" w:after="100"/>
+    </w:pPr>
+    <w:rPr>
+      <w:rFonts w:ascii="Arial" w:hAnsi="Arial"/>
+      <w:i w:val="0"/>
+      <w:color w:val="292C30"/>
+      <w:sz w:val="20"/>
+    </w:rPr>
   </w:style>
   <w:style w:type="paragraph" w:styleId="Header">
     <w:name w:val="header"/>
@@ -929,6 +1359,11 @@
       </w:tabs>
       <w:spacing w:after="0" w:line="240" w:lineRule="auto"/>
     </w:pPr>
+    <w:rPr>
+      <w:rFonts w:ascii="Arial" w:hAnsi="Arial"/>
+      <w:i w:val="0"/>
+      <w:color w:val="292C30"/>
+    </w:rPr>
   </w:style>
   <w:style w:type="character" w:customStyle="1" w:styleId="HeaderChar">
     <w:name w:val="Header Char"/>
@@ -936,6 +1371,11 @@
     <w:link w:val="Header"/>
     <w:uiPriority w:val="99"/>
     <w:rsid w:val="00E618BF"/>
+    <w:rPr>
+      <w:rFonts w:ascii="Arial" w:hAnsi="Arial"/>
+      <w:i w:val="0"/>
+      <w:color w:val="292C30"/>
+    </w:rPr>
   </w:style>
   <w:style w:type="paragraph" w:styleId="Footer">
     <w:name w:val="footer"/>
@@ -951,6 +1391,11 @@
       </w:tabs>
       <w:spacing w:after="0" w:line="240" w:lineRule="auto"/>
     </w:pPr>
+    <w:rPr>
+      <w:rFonts w:ascii="Arial" w:hAnsi="Arial"/>
+      <w:i w:val="0"/>
+      <w:color w:val="292C30"/>
+    </w:rPr>
   </w:style>
   <w:style w:type="character" w:customStyle="1" w:styleId="FooterChar">
     <w:name w:val="Footer Char"/>
@@ -958,6 +1403,11 @@
     <w:link w:val="Footer"/>
     <w:uiPriority w:val="99"/>
     <w:rsid w:val="00E618BF"/>
+    <w:rPr>
+      <w:rFonts w:ascii="Arial" w:hAnsi="Arial"/>
+      <w:i w:val="0"/>
+      <w:color w:val="292C30"/>
+    </w:rPr>
   </w:style>
   <w:style w:type="paragraph" w:styleId="Heading1">
     <w:name w:val="heading 1"/>
@@ -970,15 +1420,16 @@
     <w:pPr>
       <w:keepNext/>
       <w:keepLines/>
-      <w:spacing w:before="480" w:after="0"/>
+      <w:spacing w:before="140" w:after="100"/>
       <w:outlineLvl w:val="0"/>
     </w:pPr>
     <w:rPr>
-      <w:rFonts w:asciiTheme="majorHAnsi" w:eastAsiaTheme="majorEastAsia" w:hAnsiTheme="majorHAnsi" w:cstheme="majorBidi"/>
+      <w:rFonts w:asciiTheme="majorHAnsi" w:eastAsiaTheme="majorEastAsia" w:hAnsiTheme="majorHAnsi" w:cstheme="majorBidi" w:ascii="Arial" w:hAnsi="Arial"/>
       <w:b/>
       <w:bCs/>
-      <w:color w:val="365F91" w:themeColor="accent1" w:themeShade="BF"/>
-      <w:sz w:val="28"/>
+      <w:i w:val="0"/>
+      <w:color w:val="292C30"/>
+      <w:sz w:val="26"/>
       <w:szCs w:val="28"/>
     </w:rPr>
   </w:style>
@@ -994,15 +1445,16 @@
     <w:pPr>
       <w:keepNext/>
       <w:keepLines/>
-      <w:spacing w:before="200" w:after="0"/>
+      <w:spacing w:before="140" w:after="100"/>
       <w:outlineLvl w:val="1"/>
     </w:pPr>
     <w:rPr>
-      <w:rFonts w:asciiTheme="majorHAnsi" w:eastAsiaTheme="majorEastAsia" w:hAnsiTheme="majorHAnsi" w:cstheme="majorBidi"/>
+      <w:rFonts w:asciiTheme="majorHAnsi" w:eastAsiaTheme="majorEastAsia" w:hAnsiTheme="majorHAnsi" w:cstheme="majorBidi" w:ascii="Arial" w:hAnsi="Arial"/>
       <w:b/>
       <w:bCs/>
-      <w:color w:val="4F81BD" w:themeColor="accent1"/>
-      <w:sz w:val="26"/>
+      <w:i w:val="0"/>
+      <w:color w:val="292C30"/>
+      <w:sz w:val="22"/>
       <w:szCs w:val="26"/>
     </w:rPr>
   </w:style>
@@ -1022,10 +1474,11 @@
       <w:outlineLvl w:val="2"/>
     </w:pPr>
     <w:rPr>
-      <w:rFonts w:asciiTheme="majorHAnsi" w:eastAsiaTheme="majorEastAsia" w:hAnsiTheme="majorHAnsi" w:cstheme="majorBidi"/>
+      <w:rFonts w:asciiTheme="majorHAnsi" w:eastAsiaTheme="majorEastAsia" w:hAnsiTheme="majorHAnsi" w:cstheme="majorBidi" w:ascii="Arial" w:hAnsi="Arial"/>
       <w:b/>
       <w:bCs/>
-      <w:color w:val="4F81BD" w:themeColor="accent1"/>
+      <w:i w:val="0"/>
+      <w:color w:val="292C30"/>
     </w:rPr>
   </w:style>
   <w:style w:type="paragraph" w:styleId="Heading4">
@@ -1045,12 +1498,12 @@
       <w:outlineLvl w:val="3"/>
     </w:pPr>
     <w:rPr>
-      <w:rFonts w:asciiTheme="majorHAnsi" w:eastAsiaTheme="majorEastAsia" w:hAnsiTheme="majorHAnsi" w:cstheme="majorBidi"/>
+      <w:rFonts w:asciiTheme="majorHAnsi" w:eastAsiaTheme="majorEastAsia" w:hAnsiTheme="majorHAnsi" w:cstheme="majorBidi" w:ascii="Arial" w:hAnsi="Arial"/>
       <w:b/>
       <w:bCs/>
-      <w:i/>
-      <w:iCs/>
-      <w:color w:val="4F81BD" w:themeColor="accent1"/>
+      <w:i w:val="0"/>
+      <w:iCs w:val="0"/>
+      <w:color w:val="292C30"/>
     </w:rPr>
   </w:style>
   <w:style w:type="paragraph" w:styleId="Heading5">
@@ -1070,8 +1523,9 @@
       <w:outlineLvl w:val="4"/>
     </w:pPr>
     <w:rPr>
-      <w:rFonts w:asciiTheme="majorHAnsi" w:eastAsiaTheme="majorEastAsia" w:hAnsiTheme="majorHAnsi" w:cstheme="majorBidi"/>
-      <w:color w:val="243F60" w:themeColor="accent1" w:themeShade="7F"/>
+      <w:rFonts w:asciiTheme="majorHAnsi" w:eastAsiaTheme="majorEastAsia" w:hAnsiTheme="majorHAnsi" w:cstheme="majorBidi" w:ascii="Arial" w:hAnsi="Arial"/>
+      <w:i w:val="0"/>
+      <w:color w:val="292C30"/>
     </w:rPr>
   </w:style>
   <w:style w:type="paragraph" w:styleId="Heading6">
@@ -1091,10 +1545,10 @@
       <w:outlineLvl w:val="5"/>
     </w:pPr>
     <w:rPr>
-      <w:rFonts w:asciiTheme="majorHAnsi" w:eastAsiaTheme="majorEastAsia" w:hAnsiTheme="majorHAnsi" w:cstheme="majorBidi"/>
-      <w:i/>
-      <w:iCs/>
-      <w:color w:val="243F60" w:themeColor="accent1" w:themeShade="7F"/>
+      <w:rFonts w:asciiTheme="majorHAnsi" w:eastAsiaTheme="majorEastAsia" w:hAnsiTheme="majorHAnsi" w:cstheme="majorBidi" w:ascii="Arial" w:hAnsi="Arial"/>
+      <w:i w:val="0"/>
+      <w:iCs w:val="0"/>
+      <w:color w:val="292C30"/>
     </w:rPr>
   </w:style>
   <w:style w:type="paragraph" w:styleId="Heading7">
@@ -1114,10 +1568,10 @@
       <w:outlineLvl w:val="6"/>
     </w:pPr>
     <w:rPr>
-      <w:rFonts w:asciiTheme="majorHAnsi" w:eastAsiaTheme="majorEastAsia" w:hAnsiTheme="majorHAnsi" w:cstheme="majorBidi"/>
-      <w:i/>
-      <w:iCs/>
-      <w:color w:val="404040" w:themeColor="text1" w:themeTint="BF"/>
+      <w:rFonts w:asciiTheme="majorHAnsi" w:eastAsiaTheme="majorEastAsia" w:hAnsiTheme="majorHAnsi" w:cstheme="majorBidi" w:ascii="Arial" w:hAnsi="Arial"/>
+      <w:i w:val="0"/>
+      <w:iCs w:val="0"/>
+      <w:color w:val="292C30"/>
     </w:rPr>
   </w:style>
   <w:style w:type="paragraph" w:styleId="Heading8">
@@ -1137,8 +1591,9 @@
       <w:outlineLvl w:val="7"/>
     </w:pPr>
     <w:rPr>
-      <w:rFonts w:asciiTheme="majorHAnsi" w:eastAsiaTheme="majorEastAsia" w:hAnsiTheme="majorHAnsi" w:cstheme="majorBidi"/>
-      <w:color w:val="4F81BD" w:themeColor="accent1"/>
+      <w:rFonts w:asciiTheme="majorHAnsi" w:eastAsiaTheme="majorEastAsia" w:hAnsiTheme="majorHAnsi" w:cstheme="majorBidi" w:ascii="Arial" w:hAnsi="Arial"/>
+      <w:i w:val="0"/>
+      <w:color w:val="292C30"/>
       <w:sz w:val="20"/>
       <w:szCs w:val="20"/>
     </w:rPr>
@@ -1160,10 +1615,10 @@
       <w:outlineLvl w:val="8"/>
     </w:pPr>
     <w:rPr>
-      <w:rFonts w:asciiTheme="majorHAnsi" w:eastAsiaTheme="majorEastAsia" w:hAnsiTheme="majorHAnsi" w:cstheme="majorBidi"/>
-      <w:i/>
-      <w:iCs/>
-      <w:color w:val="404040" w:themeColor="text1" w:themeTint="BF"/>
+      <w:rFonts w:asciiTheme="majorHAnsi" w:eastAsiaTheme="majorEastAsia" w:hAnsiTheme="majorHAnsi" w:cstheme="majorBidi" w:ascii="Arial" w:hAnsi="Arial"/>
+      <w:i w:val="0"/>
+      <w:iCs w:val="0"/>
+      <w:color w:val="292C30"/>
       <w:sz w:val="20"/>
       <w:szCs w:val="20"/>
     </w:rPr>
@@ -1173,6 +1628,11 @@
     <w:uiPriority w:val="1"/>
     <w:semiHidden/>
     <w:unhideWhenUsed/>
+    <w:rPr>
+      <w:rFonts w:ascii="Arial" w:hAnsi="Arial"/>
+      <w:i w:val="0"/>
+      <w:color w:val="292C30"/>
+    </w:rPr>
   </w:style>
   <w:style w:type="table" w:default="1" w:styleId="TableNormal">
     <w:name w:val="Normal Table"/>
@@ -1203,6 +1663,11 @@
     <w:pPr>
       <w:spacing w:after="0" w:line="240" w:lineRule="auto"/>
     </w:pPr>
+    <w:rPr>
+      <w:rFonts w:ascii="Arial" w:hAnsi="Arial"/>
+      <w:i w:val="0"/>
+      <w:color w:val="292C30"/>
+    </w:rPr>
   </w:style>
   <w:style w:type="character" w:customStyle="1" w:styleId="Heading1Char">
     <w:name w:val="Heading 1 Char"/>
@@ -1211,10 +1676,11 @@
     <w:uiPriority w:val="9"/>
     <w:rsid w:val="00FC693F"/>
     <w:rPr>
-      <w:rFonts w:asciiTheme="majorHAnsi" w:eastAsiaTheme="majorEastAsia" w:hAnsiTheme="majorHAnsi" w:cstheme="majorBidi"/>
+      <w:rFonts w:asciiTheme="majorHAnsi" w:eastAsiaTheme="majorEastAsia" w:hAnsiTheme="majorHAnsi" w:cstheme="majorBidi" w:ascii="Arial" w:hAnsi="Arial"/>
       <w:b/>
       <w:bCs/>
-      <w:color w:val="365F91" w:themeColor="accent1" w:themeShade="BF"/>
+      <w:i w:val="0"/>
+      <w:color w:val="292C30"/>
       <w:sz w:val="28"/>
       <w:szCs w:val="28"/>
     </w:rPr>
@@ -1226,10 +1692,11 @@
     <w:uiPriority w:val="9"/>
     <w:rsid w:val="00FC693F"/>
     <w:rPr>
-      <w:rFonts w:asciiTheme="majorHAnsi" w:eastAsiaTheme="majorEastAsia" w:hAnsiTheme="majorHAnsi" w:cstheme="majorBidi"/>
+      <w:rFonts w:asciiTheme="majorHAnsi" w:eastAsiaTheme="majorEastAsia" w:hAnsiTheme="majorHAnsi" w:cstheme="majorBidi" w:ascii="Arial" w:hAnsi="Arial"/>
       <w:b/>
       <w:bCs/>
-      <w:color w:val="4F81BD" w:themeColor="accent1"/>
+      <w:i w:val="0"/>
+      <w:color w:val="292C30"/>
       <w:sz w:val="26"/>
       <w:szCs w:val="26"/>
     </w:rPr>
@@ -1241,10 +1708,11 @@
     <w:uiPriority w:val="9"/>
     <w:rsid w:val="00FC693F"/>
     <w:rPr>
-      <w:rFonts w:asciiTheme="majorHAnsi" w:eastAsiaTheme="majorEastAsia" w:hAnsiTheme="majorHAnsi" w:cstheme="majorBidi"/>
+      <w:rFonts w:asciiTheme="majorHAnsi" w:eastAsiaTheme="majorEastAsia" w:hAnsiTheme="majorHAnsi" w:cstheme="majorBidi" w:ascii="Arial" w:hAnsi="Arial"/>
       <w:b/>
       <w:bCs/>
-      <w:color w:val="4F81BD" w:themeColor="accent1"/>
+      <w:i w:val="0"/>
+      <w:color w:val="292C30"/>
     </w:rPr>
   </w:style>
   <w:style w:type="paragraph" w:styleId="Title">
@@ -1256,18 +1724,17 @@
     <w:qFormat/>
     <w:rsid w:val="00FC693F"/>
     <w:pPr>
-      <w:pBdr>
-        <w:bottom w:val="single" w:sz="8" w:space="4" w:color="4F81BD" w:themeColor="accent1"/>
-      </w:pBdr>
-      <w:spacing w:after="300" w:line="240" w:lineRule="auto"/>
+      <w:spacing w:after="100" w:line="240" w:lineRule="auto" w:before="140"/>
       <w:contextualSpacing/>
     </w:pPr>
     <w:rPr>
-      <w:rFonts w:asciiTheme="majorHAnsi" w:eastAsiaTheme="majorEastAsia" w:hAnsiTheme="majorHAnsi" w:cstheme="majorBidi"/>
-      <w:color w:val="17365D" w:themeColor="text2" w:themeShade="BF"/>
+      <w:rFonts w:asciiTheme="majorHAnsi" w:eastAsiaTheme="majorEastAsia" w:hAnsiTheme="majorHAnsi" w:cstheme="majorBidi" w:ascii="Arial" w:hAnsi="Arial"/>
+      <w:b/>
+      <w:i w:val="0"/>
+      <w:color w:val="292C30"/>
       <w:spacing w:val="5"/>
       <w:kern w:val="28"/>
-      <w:sz w:val="52"/>
+      <w:sz w:val="34"/>
       <w:szCs w:val="52"/>
     </w:rPr>
   </w:style>
@@ -1278,8 +1745,9 @@
     <w:uiPriority w:val="10"/>
     <w:rsid w:val="00FC693F"/>
     <w:rPr>
-      <w:rFonts w:asciiTheme="majorHAnsi" w:eastAsiaTheme="majorEastAsia" w:hAnsiTheme="majorHAnsi" w:cstheme="majorBidi"/>
-      <w:color w:val="17365D" w:themeColor="text2" w:themeShade="BF"/>
+      <w:rFonts w:asciiTheme="majorHAnsi" w:eastAsiaTheme="majorEastAsia" w:hAnsiTheme="majorHAnsi" w:cstheme="majorBidi" w:ascii="Arial" w:hAnsi="Arial"/>
+      <w:i w:val="0"/>
+      <w:color w:val="292C30"/>
       <w:spacing w:val="5"/>
       <w:kern w:val="28"/>
       <w:sz w:val="52"/>
@@ -1300,10 +1768,10 @@
       </w:numPr>
     </w:pPr>
     <w:rPr>
-      <w:rFonts w:asciiTheme="majorHAnsi" w:eastAsiaTheme="majorEastAsia" w:hAnsiTheme="majorHAnsi" w:cstheme="majorBidi"/>
-      <w:i/>
-      <w:iCs/>
-      <w:color w:val="4F81BD" w:themeColor="accent1"/>
+      <w:rFonts w:asciiTheme="majorHAnsi" w:eastAsiaTheme="majorEastAsia" w:hAnsiTheme="majorHAnsi" w:cstheme="majorBidi" w:ascii="Arial" w:hAnsi="Arial"/>
+      <w:i w:val="0"/>
+      <w:iCs w:val="0"/>
+      <w:color w:val="292C30"/>
       <w:spacing w:val="15"/>
       <w:sz w:val="24"/>
       <w:szCs w:val="24"/>
@@ -1316,10 +1784,10 @@
     <w:uiPriority w:val="11"/>
     <w:rsid w:val="00FC693F"/>
     <w:rPr>
-      <w:rFonts w:asciiTheme="majorHAnsi" w:eastAsiaTheme="majorEastAsia" w:hAnsiTheme="majorHAnsi" w:cstheme="majorBidi"/>
-      <w:i/>
-      <w:iCs/>
-      <w:color w:val="4F81BD" w:themeColor="accent1"/>
+      <w:rFonts w:asciiTheme="majorHAnsi" w:eastAsiaTheme="majorEastAsia" w:hAnsiTheme="majorHAnsi" w:cstheme="majorBidi" w:ascii="Arial" w:hAnsi="Arial"/>
+      <w:i w:val="0"/>
+      <w:iCs w:val="0"/>
+      <w:color w:val="292C30"/>
       <w:spacing w:val="15"/>
       <w:sz w:val="24"/>
       <w:szCs w:val="24"/>
@@ -1335,6 +1803,11 @@
       <w:ind w:left="720"/>
       <w:contextualSpacing/>
     </w:pPr>
+    <w:rPr>
+      <w:rFonts w:ascii="Arial" w:hAnsi="Arial"/>
+      <w:i w:val="0"/>
+      <w:color w:val="292C30"/>
+    </w:rPr>
   </w:style>
   <w:style w:type="paragraph" w:styleId="BodyText">
     <w:name w:val="Body Text"/>
@@ -1346,6 +1819,11 @@
     <w:pPr>
       <w:spacing w:after="120"/>
     </w:pPr>
+    <w:rPr>
+      <w:rFonts w:ascii="Arial" w:hAnsi="Arial"/>
+      <w:i w:val="0"/>
+      <w:color w:val="292C30"/>
+    </w:rPr>
   </w:style>
   <w:style w:type="character" w:customStyle="1" w:styleId="BodyTextChar">
     <w:name w:val="Body Text Char"/>
@@ -1353,6 +1831,11 @@
     <w:link w:val="BodyText"/>
     <w:uiPriority w:val="99"/>
     <w:rsid w:val="00AA1D8D"/>
+    <w:rPr>
+      <w:rFonts w:ascii="Arial" w:hAnsi="Arial"/>
+      <w:i w:val="0"/>
+      <w:color w:val="292C30"/>
+    </w:rPr>
   </w:style>
   <w:style w:type="paragraph" w:styleId="BodyText2">
     <w:name w:val="Body Text 2"/>
@@ -1364,6 +1847,11 @@
     <w:pPr>
       <w:spacing w:after="120" w:line="480" w:lineRule="auto"/>
     </w:pPr>
+    <w:rPr>
+      <w:rFonts w:ascii="Arial" w:hAnsi="Arial"/>
+      <w:i w:val="0"/>
+      <w:color w:val="292C30"/>
+    </w:rPr>
   </w:style>
   <w:style w:type="character" w:customStyle="1" w:styleId="BodyText2Char">
     <w:name w:val="Body Text 2 Char"/>
@@ -1371,6 +1859,11 @@
     <w:link w:val="BodyText2"/>
     <w:uiPriority w:val="99"/>
     <w:rsid w:val="00AA1D8D"/>
+    <w:rPr>
+      <w:rFonts w:ascii="Arial" w:hAnsi="Arial"/>
+      <w:i w:val="0"/>
+      <w:color w:val="292C30"/>
+    </w:rPr>
   </w:style>
   <w:style w:type="paragraph" w:styleId="BodyText3">
     <w:name w:val="Body Text 3"/>
@@ -1383,6 +1876,9 @@
       <w:spacing w:after="120"/>
     </w:pPr>
     <w:rPr>
+      <w:rFonts w:ascii="Arial" w:hAnsi="Arial"/>
+      <w:i w:val="0"/>
+      <w:color w:val="292C30"/>
       <w:sz w:val="16"/>
       <w:szCs w:val="16"/>
     </w:rPr>
@@ -1394,6 +1890,9 @@
     <w:uiPriority w:val="99"/>
     <w:rsid w:val="00AA1D8D"/>
     <w:rPr>
+      <w:rFonts w:ascii="Arial" w:hAnsi="Arial"/>
+      <w:i w:val="0"/>
+      <w:color w:val="292C30"/>
       <w:sz w:val="16"/>
       <w:szCs w:val="16"/>
     </w:rPr>
@@ -1408,6 +1907,11 @@
       <w:ind w:left="360" w:hanging="360"/>
       <w:contextualSpacing/>
     </w:pPr>
+    <w:rPr>
+      <w:rFonts w:ascii="Arial" w:hAnsi="Arial"/>
+      <w:i w:val="0"/>
+      <w:color w:val="292C30"/>
+    </w:rPr>
   </w:style>
   <w:style w:type="paragraph" w:styleId="List2">
     <w:name w:val="List 2"/>
@@ -1419,6 +1923,11 @@
       <w:ind w:left="720" w:hanging="360"/>
       <w:contextualSpacing/>
     </w:pPr>
+    <w:rPr>
+      <w:rFonts w:ascii="Arial" w:hAnsi="Arial"/>
+      <w:i w:val="0"/>
+      <w:color w:val="292C30"/>
+    </w:rPr>
   </w:style>
   <w:style w:type="paragraph" w:styleId="List3">
     <w:name w:val="List 3"/>
@@ -1430,6 +1939,11 @@
       <w:ind w:left="1080" w:hanging="360"/>
       <w:contextualSpacing/>
     </w:pPr>
+    <w:rPr>
+      <w:rFonts w:ascii="Arial" w:hAnsi="Arial"/>
+      <w:i w:val="0"/>
+      <w:color w:val="292C30"/>
+    </w:rPr>
   </w:style>
   <w:style w:type="paragraph" w:styleId="ListBullet">
     <w:name w:val="List Bullet"/>
@@ -1443,6 +1957,11 @@
       </w:numPr>
       <w:contextualSpacing/>
     </w:pPr>
+    <w:rPr>
+      <w:rFonts w:ascii="Arial" w:hAnsi="Arial"/>
+      <w:i w:val="0"/>
+      <w:color w:val="292C30"/>
+    </w:rPr>
   </w:style>
   <w:style w:type="paragraph" w:styleId="ListBullet2">
     <w:name w:val="List Bullet 2"/>
@@ -1456,6 +1975,11 @@
       </w:numPr>
       <w:contextualSpacing/>
     </w:pPr>
+    <w:rPr>
+      <w:rFonts w:ascii="Arial" w:hAnsi="Arial"/>
+      <w:i w:val="0"/>
+      <w:color w:val="292C30"/>
+    </w:rPr>
   </w:style>
   <w:style w:type="paragraph" w:styleId="ListBullet3">
     <w:name w:val="List Bullet 3"/>
@@ -1469,6 +1993,11 @@
       </w:numPr>
       <w:contextualSpacing/>
     </w:pPr>
+    <w:rPr>
+      <w:rFonts w:ascii="Arial" w:hAnsi="Arial"/>
+      <w:i w:val="0"/>
+      <w:color w:val="292C30"/>
+    </w:rPr>
   </w:style>
   <w:style w:type="paragraph" w:styleId="ListNumber">
     <w:name w:val="List Number"/>
@@ -1482,6 +2011,11 @@
       </w:numPr>
       <w:contextualSpacing/>
     </w:pPr>
+    <w:rPr>
+      <w:rFonts w:ascii="Arial" w:hAnsi="Arial"/>
+      <w:i w:val="0"/>
+      <w:color w:val="292C30"/>
+    </w:rPr>
   </w:style>
   <w:style w:type="paragraph" w:styleId="ListNumber2">
     <w:name w:val="List Number 2"/>
@@ -1495,6 +2029,11 @@
       </w:numPr>
       <w:contextualSpacing/>
     </w:pPr>
+    <w:rPr>
+      <w:rFonts w:ascii="Arial" w:hAnsi="Arial"/>
+      <w:i w:val="0"/>
+      <w:color w:val="292C30"/>
+    </w:rPr>
   </w:style>
   <w:style w:type="paragraph" w:styleId="ListNumber3">
     <w:name w:val="List Number 3"/>
@@ -1508,6 +2047,11 @@
       </w:numPr>
       <w:contextualSpacing/>
     </w:pPr>
+    <w:rPr>
+      <w:rFonts w:ascii="Arial" w:hAnsi="Arial"/>
+      <w:i w:val="0"/>
+      <w:color w:val="292C30"/>
+    </w:rPr>
   </w:style>
   <w:style w:type="paragraph" w:styleId="ListContinue">
     <w:name w:val="List Continue"/>
@@ -1520,6 +2064,11 @@
       <w:ind w:left="360"/>
       <w:contextualSpacing/>
     </w:pPr>
+    <w:rPr>
+      <w:rFonts w:ascii="Arial" w:hAnsi="Arial"/>
+      <w:i w:val="0"/>
+      <w:color w:val="292C30"/>
+    </w:rPr>
   </w:style>
   <w:style w:type="paragraph" w:styleId="ListContinue2">
     <w:name w:val="List Continue 2"/>
@@ -1532,6 +2081,11 @@
       <w:ind w:left="720"/>
       <w:contextualSpacing/>
     </w:pPr>
+    <w:rPr>
+      <w:rFonts w:ascii="Arial" w:hAnsi="Arial"/>
+      <w:i w:val="0"/>
+      <w:color w:val="292C30"/>
+    </w:rPr>
   </w:style>
   <w:style w:type="paragraph" w:styleId="ListContinue3">
     <w:name w:val="List Continue 3"/>
@@ -1544,6 +2098,11 @@
       <w:ind w:left="1080"/>
       <w:contextualSpacing/>
     </w:pPr>
+    <w:rPr>
+      <w:rFonts w:ascii="Arial" w:hAnsi="Arial"/>
+      <w:i w:val="0"/>
+      <w:color w:val="292C30"/>
+    </w:rPr>
   </w:style>
   <w:style w:type="paragraph" w:styleId="MacroText">
     <w:name w:val="macro"/>
@@ -1563,7 +2122,9 @@
       </w:tabs>
     </w:pPr>
     <w:rPr>
-      <w:rFonts w:ascii="Courier" w:hAnsi="Courier"/>
+      <w:rFonts w:ascii="Arial" w:hAnsi="Arial"/>
+      <w:i w:val="0"/>
+      <w:color w:val="292C30"/>
       <w:sz w:val="20"/>
       <w:szCs w:val="20"/>
     </w:rPr>
@@ -1575,7 +2136,9 @@
     <w:uiPriority w:val="99"/>
     <w:rsid w:val="0029639D"/>
     <w:rPr>
-      <w:rFonts w:ascii="Courier" w:hAnsi="Courier"/>
+      <w:rFonts w:ascii="Arial" w:hAnsi="Arial"/>
+      <w:i w:val="0"/>
+      <w:color w:val="292C30"/>
       <w:sz w:val="20"/>
       <w:szCs w:val="20"/>
     </w:rPr>
@@ -1589,9 +2152,10 @@
     <w:qFormat/>
     <w:rsid w:val="00FC693F"/>
     <w:rPr>
-      <w:i/>
-      <w:iCs/>
-      <w:color w:val="000000" w:themeColor="text1"/>
+      <w:rFonts w:ascii="Arial" w:hAnsi="Arial"/>
+      <w:i w:val="0"/>
+      <w:iCs w:val="0"/>
+      <w:color w:val="292C30"/>
     </w:rPr>
   </w:style>
   <w:style w:type="character" w:customStyle="1" w:styleId="QuoteChar">
@@ -1601,9 +2165,10 @@
     <w:uiPriority w:val="29"/>
     <w:rsid w:val="00FC693F"/>
     <w:rPr>
-      <w:i/>
-      <w:iCs/>
-      <w:color w:val="000000" w:themeColor="text1"/>
+      <w:rFonts w:ascii="Arial" w:hAnsi="Arial"/>
+      <w:i w:val="0"/>
+      <w:iCs w:val="0"/>
+      <w:color w:val="292C30"/>
     </w:rPr>
   </w:style>
   <w:style w:type="character" w:customStyle="1" w:styleId="Heading4Char">
@@ -1614,12 +2179,12 @@
     <w:semiHidden/>
     <w:rsid w:val="00FC693F"/>
     <w:rPr>
-      <w:rFonts w:asciiTheme="majorHAnsi" w:eastAsiaTheme="majorEastAsia" w:hAnsiTheme="majorHAnsi" w:cstheme="majorBidi"/>
+      <w:rFonts w:asciiTheme="majorHAnsi" w:eastAsiaTheme="majorEastAsia" w:hAnsiTheme="majorHAnsi" w:cstheme="majorBidi" w:ascii="Arial" w:hAnsi="Arial"/>
       <w:b/>
       <w:bCs/>
-      <w:i/>
-      <w:iCs/>
-      <w:color w:val="4F81BD" w:themeColor="accent1"/>
+      <w:i w:val="0"/>
+      <w:iCs w:val="0"/>
+      <w:color w:val="292C30"/>
     </w:rPr>
   </w:style>
   <w:style w:type="character" w:customStyle="1" w:styleId="Heading5Char">
@@ -1630,8 +2195,9 @@
     <w:semiHidden/>
     <w:rsid w:val="00FC693F"/>
     <w:rPr>
-      <w:rFonts w:asciiTheme="majorHAnsi" w:eastAsiaTheme="majorEastAsia" w:hAnsiTheme="majorHAnsi" w:cstheme="majorBidi"/>
-      <w:color w:val="243F60" w:themeColor="accent1" w:themeShade="7F"/>
+      <w:rFonts w:asciiTheme="majorHAnsi" w:eastAsiaTheme="majorEastAsia" w:hAnsiTheme="majorHAnsi" w:cstheme="majorBidi" w:ascii="Arial" w:hAnsi="Arial"/>
+      <w:i w:val="0"/>
+      <w:color w:val="292C30"/>
     </w:rPr>
   </w:style>
   <w:style w:type="character" w:customStyle="1" w:styleId="Heading6Char">
@@ -1642,10 +2208,10 @@
     <w:semiHidden/>
     <w:rsid w:val="00FC693F"/>
     <w:rPr>
-      <w:rFonts w:asciiTheme="majorHAnsi" w:eastAsiaTheme="majorEastAsia" w:hAnsiTheme="majorHAnsi" w:cstheme="majorBidi"/>
-      <w:i/>
-      <w:iCs/>
-      <w:color w:val="243F60" w:themeColor="accent1" w:themeShade="7F"/>
+      <w:rFonts w:asciiTheme="majorHAnsi" w:eastAsiaTheme="majorEastAsia" w:hAnsiTheme="majorHAnsi" w:cstheme="majorBidi" w:ascii="Arial" w:hAnsi="Arial"/>
+      <w:i w:val="0"/>
+      <w:iCs w:val="0"/>
+      <w:color w:val="292C30"/>
     </w:rPr>
   </w:style>
   <w:style w:type="character" w:customStyle="1" w:styleId="Heading7Char">
@@ -1656,10 +2222,10 @@
     <w:semiHidden/>
     <w:rsid w:val="00FC693F"/>
     <w:rPr>
-      <w:rFonts w:asciiTheme="majorHAnsi" w:eastAsiaTheme="majorEastAsia" w:hAnsiTheme="majorHAnsi" w:cstheme="majorBidi"/>
-      <w:i/>
-      <w:iCs/>
-      <w:color w:val="404040" w:themeColor="text1" w:themeTint="BF"/>
+      <w:rFonts w:asciiTheme="majorHAnsi" w:eastAsiaTheme="majorEastAsia" w:hAnsiTheme="majorHAnsi" w:cstheme="majorBidi" w:ascii="Arial" w:hAnsi="Arial"/>
+      <w:i w:val="0"/>
+      <w:iCs w:val="0"/>
+      <w:color w:val="292C30"/>
     </w:rPr>
   </w:style>
   <w:style w:type="character" w:customStyle="1" w:styleId="Heading8Char">
@@ -1670,8 +2236,9 @@
     <w:semiHidden/>
     <w:rsid w:val="00FC693F"/>
     <w:rPr>
-      <w:rFonts w:asciiTheme="majorHAnsi" w:eastAsiaTheme="majorEastAsia" w:hAnsiTheme="majorHAnsi" w:cstheme="majorBidi"/>
-      <w:color w:val="4F81BD" w:themeColor="accent1"/>
+      <w:rFonts w:asciiTheme="majorHAnsi" w:eastAsiaTheme="majorEastAsia" w:hAnsiTheme="majorHAnsi" w:cstheme="majorBidi" w:ascii="Arial" w:hAnsi="Arial"/>
+      <w:i w:val="0"/>
+      <w:color w:val="292C30"/>
       <w:sz w:val="20"/>
       <w:szCs w:val="20"/>
     </w:rPr>
@@ -1684,10 +2251,10 @@
     <w:semiHidden/>
     <w:rsid w:val="00FC693F"/>
     <w:rPr>
-      <w:rFonts w:asciiTheme="majorHAnsi" w:eastAsiaTheme="majorEastAsia" w:hAnsiTheme="majorHAnsi" w:cstheme="majorBidi"/>
-      <w:i/>
-      <w:iCs/>
-      <w:color w:val="404040" w:themeColor="text1" w:themeTint="BF"/>
+      <w:rFonts w:asciiTheme="majorHAnsi" w:eastAsiaTheme="majorEastAsia" w:hAnsiTheme="majorHAnsi" w:cstheme="majorBidi" w:ascii="Arial" w:hAnsi="Arial"/>
+      <w:i w:val="0"/>
+      <w:iCs w:val="0"/>
+      <w:color w:val="292C30"/>
       <w:sz w:val="20"/>
       <w:szCs w:val="20"/>
     </w:rPr>
@@ -1705,9 +2272,11 @@
       <w:spacing w:line="240" w:lineRule="auto"/>
     </w:pPr>
     <w:rPr>
+      <w:rFonts w:ascii="Arial" w:hAnsi="Arial"/>
       <w:b/>
       <w:bCs/>
-      <w:color w:val="4F81BD" w:themeColor="accent1"/>
+      <w:i w:val="0"/>
+      <w:color w:val="292C30"/>
       <w:sz w:val="18"/>
       <w:szCs w:val="18"/>
     </w:rPr>
@@ -1719,8 +2288,11 @@
     <w:qFormat/>
     <w:rsid w:val="00FC693F"/>
     <w:rPr>
+      <w:rFonts w:ascii="Arial" w:hAnsi="Arial"/>
       <w:b/>
       <w:bCs/>
+      <w:i w:val="0"/>
+      <w:color w:val="292C30"/>
     </w:rPr>
   </w:style>
   <w:style w:type="character" w:styleId="Emphasis">
@@ -1730,8 +2302,10 @@
     <w:qFormat/>
     <w:rsid w:val="00FC693F"/>
     <w:rPr>
-      <w:i/>
-      <w:iCs/>
+      <w:rFonts w:ascii="Arial" w:hAnsi="Arial"/>
+      <w:i w:val="0"/>
+      <w:iCs w:val="0"/>
+      <w:color w:val="292C30"/>
     </w:rPr>
   </w:style>
   <w:style w:type="paragraph" w:styleId="IntenseQuote">
@@ -1743,18 +2317,16 @@
     <w:qFormat/>
     <w:rsid w:val="00FC693F"/>
     <w:pPr>
-      <w:pBdr>
-        <w:bottom w:val="single" w:sz="4" w:space="4" w:color="4F81BD" w:themeColor="accent1"/>
-      </w:pBdr>
       <w:spacing w:before="200" w:after="280"/>
       <w:ind w:left="936" w:right="936"/>
     </w:pPr>
     <w:rPr>
+      <w:rFonts w:ascii="Arial" w:hAnsi="Arial"/>
       <w:b/>
       <w:bCs/>
-      <w:i/>
-      <w:iCs/>
-      <w:color w:val="4F81BD" w:themeColor="accent1"/>
+      <w:i w:val="0"/>
+      <w:iCs w:val="0"/>
+      <w:color w:val="292C30"/>
     </w:rPr>
   </w:style>
   <w:style w:type="character" w:customStyle="1" w:styleId="IntenseQuoteChar">
@@ -1764,11 +2336,12 @@
     <w:uiPriority w:val="30"/>
     <w:rsid w:val="00FC693F"/>
     <w:rPr>
+      <w:rFonts w:ascii="Arial" w:hAnsi="Arial"/>
       <w:b/>
       <w:bCs/>
-      <w:i/>
-      <w:iCs/>
-      <w:color w:val="4F81BD" w:themeColor="accent1"/>
+      <w:i w:val="0"/>
+      <w:iCs w:val="0"/>
+      <w:color w:val="292C30"/>
     </w:rPr>
   </w:style>
   <w:style w:type="character" w:styleId="SubtleEmphasis">
@@ -1778,9 +2351,10 @@
     <w:qFormat/>
     <w:rsid w:val="00FC693F"/>
     <w:rPr>
-      <w:i/>
-      <w:iCs/>
-      <w:color w:val="808080" w:themeColor="text1" w:themeTint="7F"/>
+      <w:rFonts w:ascii="Arial" w:hAnsi="Arial"/>
+      <w:i w:val="0"/>
+      <w:iCs w:val="0"/>
+      <w:color w:val="292C30"/>
     </w:rPr>
   </w:style>
   <w:style w:type="character" w:styleId="IntenseEmphasis">
@@ -1790,11 +2364,12 @@
     <w:qFormat/>
     <w:rsid w:val="00FC693F"/>
     <w:rPr>
+      <w:rFonts w:ascii="Arial" w:hAnsi="Arial"/>
       <w:b/>
       <w:bCs/>
-      <w:i/>
-      <w:iCs/>
-      <w:color w:val="4F81BD" w:themeColor="accent1"/>
+      <w:i w:val="0"/>
+      <w:iCs w:val="0"/>
+      <w:color w:val="292C30"/>
     </w:rPr>
   </w:style>
   <w:style w:type="character" w:styleId="SubtleReference">
@@ -1804,8 +2379,10 @@
     <w:qFormat/>
     <w:rsid w:val="00FC693F"/>
     <w:rPr>
+      <w:rFonts w:ascii="Arial" w:hAnsi="Arial"/>
+      <w:i w:val="0"/>
       <w:smallCaps/>
-      <w:color w:val="C0504D" w:themeColor="accent2"/>
+      <w:color w:val="292C30"/>
       <w:u w:val="single"/>
     </w:rPr>
   </w:style>
@@ -1816,10 +2393,12 @@
     <w:qFormat/>
     <w:rsid w:val="00FC693F"/>
     <w:rPr>
+      <w:rFonts w:ascii="Arial" w:hAnsi="Arial"/>
       <w:b/>
       <w:bCs/>
+      <w:i w:val="0"/>
       <w:smallCaps/>
-      <w:color w:val="C0504D" w:themeColor="accent2"/>
+      <w:color w:val="292C30"/>
       <w:spacing w:val="5"/>
       <w:u w:val="single"/>
     </w:rPr>
@@ -1831,9 +2410,12 @@
     <w:qFormat/>
     <w:rsid w:val="00FC693F"/>
     <w:rPr>
+      <w:rFonts w:ascii="Arial" w:hAnsi="Arial"/>
       <w:b/>
       <w:bCs/>
+      <w:i w:val="0"/>
       <w:smallCaps/>
+      <w:color w:val="292C30"/>
       <w:spacing w:val="5"/>
     </w:rPr>
   </w:style>
@@ -1849,6 +2431,11 @@
     <w:pPr>
       <w:outlineLvl w:val="9"/>
     </w:pPr>
+    <w:rPr>
+      <w:rFonts w:ascii="Arial" w:hAnsi="Arial"/>
+      <w:i w:val="0"/>
+      <w:color w:val="292C30"/>
+    </w:rPr>
   </w:style>
   <w:style w:type="table" w:styleId="TableGrid">
     <w:name w:val="Table Grid"/>
@@ -12850,8 +13437,8 @@
       <w:rFonts w:asciiTheme="majorHAnsi" w:eastAsiaTheme="majorEastAsia" w:hAnsiTheme="majorHAnsi" w:cstheme="majorBidi"/>
       <w:b/>
       <w:bCs/>
-      <w:i/>
-      <w:iCs/>
+      <w:i w:val="0"/>
+      <w:iCs w:val="0"/>
       <w:color w:val="4F81BD" w:themeColor="accent1"/>
     </w:rPr>
   </w:style>
@@ -12894,8 +13481,8 @@
     </w:pPr>
     <w:rPr>
       <w:rFonts w:asciiTheme="majorHAnsi" w:eastAsiaTheme="majorEastAsia" w:hAnsiTheme="majorHAnsi" w:cstheme="majorBidi"/>
-      <w:i/>
-      <w:iCs/>
+      <w:i w:val="0"/>
+      <w:iCs w:val="0"/>
       <w:color w:val="243F60" w:themeColor="accent1" w:themeShade="7F"/>
     </w:rPr>
   </w:style>
@@ -12917,8 +13504,8 @@
     </w:pPr>
     <w:rPr>
       <w:rFonts w:asciiTheme="majorHAnsi" w:eastAsiaTheme="majorEastAsia" w:hAnsiTheme="majorHAnsi" w:cstheme="majorBidi"/>
-      <w:i/>
-      <w:iCs/>
+      <w:i w:val="0"/>
+      <w:iCs w:val="0"/>
       <w:color w:val="404040" w:themeColor="text1" w:themeTint="BF"/>
     </w:rPr>
   </w:style>
@@ -12963,8 +13550,8 @@
     </w:pPr>
     <w:rPr>
       <w:rFonts w:asciiTheme="majorHAnsi" w:eastAsiaTheme="majorEastAsia" w:hAnsiTheme="majorHAnsi" w:cstheme="majorBidi"/>
-      <w:i/>
-      <w:iCs/>
+      <w:i w:val="0"/>
+      <w:iCs w:val="0"/>
       <w:color w:val="404040" w:themeColor="text1" w:themeTint="BF"/>
       <w:sz w:val="20"/>
       <w:szCs w:val="20"/>
@@ -13103,8 +13690,8 @@
     </w:pPr>
     <w:rPr>
       <w:rFonts w:asciiTheme="majorHAnsi" w:eastAsiaTheme="majorEastAsia" w:hAnsiTheme="majorHAnsi" w:cstheme="majorBidi"/>
-      <w:i/>
-      <w:iCs/>
+      <w:i w:val="0"/>
+      <w:iCs w:val="0"/>
       <w:color w:val="4F81BD" w:themeColor="accent1"/>
       <w:spacing w:val="15"/>
       <w:sz w:val="24"/>
@@ -13119,8 +13706,8 @@
     <w:rsid w:val="00FC693F"/>
     <w:rPr>
       <w:rFonts w:asciiTheme="majorHAnsi" w:eastAsiaTheme="majorEastAsia" w:hAnsiTheme="majorHAnsi" w:cstheme="majorBidi"/>
-      <w:i/>
-      <w:iCs/>
+      <w:i w:val="0"/>
+      <w:iCs w:val="0"/>
       <w:color w:val="4F81BD" w:themeColor="accent1"/>
       <w:spacing w:val="15"/>
       <w:sz w:val="24"/>
@@ -13391,8 +13978,8 @@
     <w:qFormat/>
     <w:rsid w:val="00FC693F"/>
     <w:rPr>
-      <w:i/>
-      <w:iCs/>
+      <w:i w:val="0"/>
+      <w:iCs w:val="0"/>
       <w:color w:val="000000" w:themeColor="text1"/>
     </w:rPr>
   </w:style>
@@ -13403,8 +13990,8 @@
     <w:uiPriority w:val="29"/>
     <w:rsid w:val="00FC693F"/>
     <w:rPr>
-      <w:i/>
-      <w:iCs/>
+      <w:i w:val="0"/>
+      <w:iCs w:val="0"/>
       <w:color w:val="000000" w:themeColor="text1"/>
     </w:rPr>
   </w:style>
@@ -13419,8 +14006,8 @@
       <w:rFonts w:asciiTheme="majorHAnsi" w:eastAsiaTheme="majorEastAsia" w:hAnsiTheme="majorHAnsi" w:cstheme="majorBidi"/>
       <w:b/>
       <w:bCs/>
-      <w:i/>
-      <w:iCs/>
+      <w:i w:val="0"/>
+      <w:iCs w:val="0"/>
       <w:color w:val="4F81BD" w:themeColor="accent1"/>
     </w:rPr>
   </w:style>
@@ -13445,8 +14032,8 @@
     <w:rsid w:val="00FC693F"/>
     <w:rPr>
       <w:rFonts w:asciiTheme="majorHAnsi" w:eastAsiaTheme="majorEastAsia" w:hAnsiTheme="majorHAnsi" w:cstheme="majorBidi"/>
-      <w:i/>
-      <w:iCs/>
+      <w:i w:val="0"/>
+      <w:iCs w:val="0"/>
       <w:color w:val="243F60" w:themeColor="accent1" w:themeShade="7F"/>
     </w:rPr>
   </w:style>
@@ -13459,8 +14046,8 @@
     <w:rsid w:val="00FC693F"/>
     <w:rPr>
       <w:rFonts w:asciiTheme="majorHAnsi" w:eastAsiaTheme="majorEastAsia" w:hAnsiTheme="majorHAnsi" w:cstheme="majorBidi"/>
-      <w:i/>
-      <w:iCs/>
+      <w:i w:val="0"/>
+      <w:iCs w:val="0"/>
       <w:color w:val="404040" w:themeColor="text1" w:themeTint="BF"/>
     </w:rPr>
   </w:style>
@@ -13487,8 +14074,8 @@
     <w:rsid w:val="00FC693F"/>
     <w:rPr>
       <w:rFonts w:asciiTheme="majorHAnsi" w:eastAsiaTheme="majorEastAsia" w:hAnsiTheme="majorHAnsi" w:cstheme="majorBidi"/>
-      <w:i/>
-      <w:iCs/>
+      <w:i w:val="0"/>
+      <w:iCs w:val="0"/>
       <w:color w:val="404040" w:themeColor="text1" w:themeTint="BF"/>
       <w:sz w:val="20"/>
       <w:szCs w:val="20"/>
@@ -13532,8 +14119,8 @@
     <w:qFormat/>
     <w:rsid w:val="00FC693F"/>
     <w:rPr>
-      <w:i/>
-      <w:iCs/>
+      <w:i w:val="0"/>
+      <w:iCs w:val="0"/>
     </w:rPr>
   </w:style>
   <w:style w:type="paragraph" w:styleId="IntenseQuote">
@@ -13554,8 +14141,8 @@
     <w:rPr>
       <w:b/>
       <w:bCs/>
-      <w:i/>
-      <w:iCs/>
+      <w:i w:val="0"/>
+      <w:iCs w:val="0"/>
       <w:color w:val="4F81BD" w:themeColor="accent1"/>
     </w:rPr>
   </w:style>
@@ -13568,8 +14155,8 @@
     <w:rPr>
       <w:b/>
       <w:bCs/>
-      <w:i/>
-      <w:iCs/>
+      <w:i w:val="0"/>
+      <w:iCs w:val="0"/>
       <w:color w:val="4F81BD" w:themeColor="accent1"/>
     </w:rPr>
   </w:style>
@@ -13580,8 +14167,8 @@
     <w:qFormat/>
     <w:rsid w:val="00FC693F"/>
     <w:rPr>
-      <w:i/>
-      <w:iCs/>
+      <w:i w:val="0"/>
+      <w:iCs w:val="0"/>
       <w:color w:val="808080" w:themeColor="text1" w:themeTint="7F"/>
     </w:rPr>
   </w:style>
@@ -13594,8 +14181,8 @@
     <w:rPr>
       <w:b/>
       <w:bCs/>
-      <w:i/>
-      <w:iCs/>
+      <w:i w:val="0"/>
+      <w:iCs w:val="0"/>
       <w:color w:val="4F81BD" w:themeColor="accent1"/>
     </w:rPr>
   </w:style>

</xml_diff>

<commit_message>
release(p3): bundle accepted 11 files and 17900 RUB on main baseline
</commit_message>
<xml_diff>
--- a/products-storage/05-ks-bez-vozvrata/04-protokol-vnutrenney-proverki.docx
+++ b/products-storage/05-ks-bez-vozvrata/04-protokol-vnutrenney-proverki.docx
@@ -5,550 +5,971 @@
     <w:p>
       <w:pPr>
         <w:pStyle w:val="Title"/>
-        <w:jc w:val="center"/>
       </w:pPr>
       <w:r>
-        <w:t>ПРОТОКОЛ внутренней проверки комплекта КС</w:t>
-      </w:r>
-    </w:p>
-    <w:p/>
-    <w:p>
-      <w:r>
-        <w:t>ПРОТОКОЛ ВНУТРЕННЕЙ ПРОВЕРКИ</w:t>
+        <w:t>Протокол внутренней проверки комплекта КС</w:t>
       </w:r>
     </w:p>
     <w:p>
+      <w:pPr>
+        <w:spacing w:after="100"/>
+      </w:pPr>
       <w:r>
-        <w:t>комплекта исполнительной документации (КС)</w:t>
-      </w:r>
-    </w:p>
-    <w:p/>
-    <w:p>
-      <w:r>
-        <w:t>Дата проверки: '___' ___________ 20___ г.</w:t>
+        <w:rPr>
+          <w:b w:val="0"/>
+          <w:i w:val="0"/>
+          <w:sz w:val="18"/>
+        </w:rPr>
+        <w:t>Протокол № __________  Дата __________  Отчётный период __________</w:t>
       </w:r>
     </w:p>
     <w:p>
+      <w:pPr>
+        <w:spacing w:after="100"/>
+      </w:pPr>
       <w:r>
-        <w:t>Объект: _________________________________________________________________</w:t>
+        <w:rPr>
+          <w:b w:val="0"/>
+          <w:i w:val="0"/>
+          <w:sz w:val="20"/>
+        </w:rPr>
+        <w:t>Объект / участок ___________________________________________________</w:t>
       </w:r>
     </w:p>
     <w:p>
+      <w:pPr>
+        <w:spacing w:after="100"/>
+      </w:pPr>
       <w:r>
-        <w:t>Договор подряда № _____ от '___' ___________ 20___ г.</w:t>
-      </w:r>
-    </w:p>
-    <w:p/>
-    <w:p>
-      <w:r>
-        <w:t>Проверяющая комиссия в составе:</w:t>
+        <w:rPr>
+          <w:b w:val="0"/>
+          <w:i w:val="0"/>
+          <w:sz w:val="20"/>
+        </w:rPr>
+        <w:t>Договор № __________________  Проверяющий __________________________</w:t>
       </w:r>
     </w:p>
     <w:p>
+      <w:pPr>
+        <w:spacing w:after="100"/>
+      </w:pPr>
       <w:r>
-        <w:t>1. Председатель: _________________________________________________________</w:t>
+        <w:rPr>
+          <w:b w:val="0"/>
+          <w:i w:val="0"/>
+          <w:sz w:val="20"/>
+        </w:rPr>
+        <w:t>КС-2 (перечень номеров) __________________  КС-3 № ____________________</w:t>
       </w:r>
     </w:p>
     <w:p>
+      <w:pPr>
+        <w:spacing w:after="100"/>
+      </w:pPr>
       <w:r>
-        <w:t>2. Член комиссии: ________________________________________________________</w:t>
+        <w:rPr>
+          <w:b w:val="0"/>
+          <w:i w:val="0"/>
+          <w:sz w:val="18"/>
+        </w:rPr>
+        <w:t>Состав приложений — реестр №02 от __________. Проверочный лист №01 от __________.</w:t>
       </w:r>
     </w:p>
     <w:p>
-      <w:r>
-        <w:t>3. Член комиссии: ________________________________________________________</w:t>
-      </w:r>
-    </w:p>
-    <w:p/>
-    <w:p>
-      <w:r>
-        <w:t>Проверяемый комплект: КС-2 № _____ / КС-3 № _____ от '___' ___________ 20___ г.</w:t>
-      </w:r>
-    </w:p>
-    <w:p/>
-    <w:p>
       <w:pPr>
-        <w:pStyle w:val="Heading1"/>
+        <w:pStyle w:val="Heading2"/>
       </w:pPr>
       <w:r>
-        <w:t>Результаты проверки</w:t>
+        <w:t>Замечания и повторная проверка</w:t>
       </w:r>
     </w:p>
     <w:tbl>
       <w:tblPr>
-        <w:tblStyle w:val="TableGrid"/>
         <w:tblW w:type="auto" w:w="0"/>
+        <w:jc w:val="center"/>
+        <w:tblLayout w:type="fixed"/>
         <w:tblLook w:firstColumn="1" w:firstRow="1" w:lastColumn="0" w:lastRow="0" w:noHBand="0" w:noVBand="1" w:val="04A0"/>
       </w:tblPr>
       <w:tblGrid>
-        <w:gridCol w:w="1728"/>
-        <w:gridCol w:w="1728"/>
-        <w:gridCol w:w="1728"/>
-        <w:gridCol w:w="1728"/>
-        <w:gridCol w:w="1728"/>
+        <w:gridCol w:w="964"/>
+        <w:gridCol w:w="3005"/>
+        <w:gridCol w:w="2211"/>
+        <w:gridCol w:w="1247"/>
+        <w:gridCol w:w="2438"/>
       </w:tblGrid>
       <w:tr>
+        <w:trPr>
+          <w:cantSplit/>
+          <w:tblHeader/>
+        </w:trPr>
         <w:tc>
           <w:tcPr>
-            <w:tcW w:type="dxa" w:w="1728"/>
+            <w:tcW w:type="dxa" w:w="964"/>
+            <w:vAlign w:val="center"/>
+            <w:shd w:fill="292C30"/>
+            <w:tcMar>
+              <w:top w:w="80" w:type="dxa"/>
+              <w:left w:w="80" w:type="dxa"/>
+              <w:bottom w:w="80" w:type="dxa"/>
+              <w:right w:w="80" w:type="dxa"/>
+            </w:tcMar>
           </w:tcPr>
           <w:p>
+            <w:pPr>
+              <w:spacing w:after="60" w:before="40" w:line="245" w:lineRule="auto"/>
+            </w:pPr>
             <w:r>
-              <w:t>№</w:t>
+              <w:rPr>
+                <w:rFonts w:ascii="Arial" w:hAnsi="Arial"/>
+                <w:b/>
+                <w:i w:val="0"/>
+                <w:color w:val="FFFFFF"/>
+                <w:sz w:val="18"/>
+              </w:rPr>
+              <w:t>№ / пункт №01</w:t>
             </w:r>
           </w:p>
         </w:tc>
         <w:tc>
           <w:tcPr>
-            <w:tcW w:type="dxa" w:w="1728"/>
+            <w:tcW w:type="dxa" w:w="3005"/>
+            <w:vAlign w:val="center"/>
+            <w:shd w:fill="292C30"/>
+            <w:tcMar>
+              <w:top w:w="80" w:type="dxa"/>
+              <w:left w:w="80" w:type="dxa"/>
+              <w:bottom w:w="80" w:type="dxa"/>
+              <w:right w:w="80" w:type="dxa"/>
+            </w:tcMar>
           </w:tcPr>
           <w:p>
+            <w:pPr>
+              <w:spacing w:after="60" w:before="40" w:line="245" w:lineRule="auto"/>
+            </w:pPr>
             <w:r>
-              <w:t>Пункт проверки</w:t>
+              <w:rPr>
+                <w:rFonts w:ascii="Arial" w:hAnsi="Arial"/>
+                <w:b/>
+                <w:i w:val="0"/>
+                <w:color w:val="FFFFFF"/>
+                <w:sz w:val="18"/>
+              </w:rPr>
+              <w:t>Документ, лист и замечание</w:t>
             </w:r>
           </w:p>
         </w:tc>
         <w:tc>
           <w:tcPr>
-            <w:tcW w:type="dxa" w:w="1728"/>
+            <w:tcW w:type="dxa" w:w="2211"/>
+            <w:vAlign w:val="center"/>
+            <w:shd w:fill="292C30"/>
+            <w:tcMar>
+              <w:top w:w="80" w:type="dxa"/>
+              <w:left w:w="80" w:type="dxa"/>
+              <w:bottom w:w="80" w:type="dxa"/>
+              <w:right w:w="80" w:type="dxa"/>
+            </w:tcMar>
           </w:tcPr>
           <w:p>
+            <w:pPr>
+              <w:spacing w:after="60" w:before="40" w:line="245" w:lineRule="auto"/>
+            </w:pPr>
             <w:r>
-              <w:t>Результат</w:t>
+              <w:rPr>
+                <w:rFonts w:ascii="Arial" w:hAnsi="Arial"/>
+                <w:b/>
+                <w:i w:val="0"/>
+                <w:color w:val="FFFFFF"/>
+                <w:sz w:val="18"/>
+              </w:rPr>
+              <w:t>Действие и ответственный</w:t>
             </w:r>
           </w:p>
         </w:tc>
         <w:tc>
           <w:tcPr>
-            <w:tcW w:type="dxa" w:w="1728"/>
+            <w:tcW w:type="dxa" w:w="1247"/>
+            <w:vAlign w:val="center"/>
+            <w:shd w:fill="292C30"/>
+            <w:tcMar>
+              <w:top w:w="80" w:type="dxa"/>
+              <w:left w:w="80" w:type="dxa"/>
+              <w:bottom w:w="80" w:type="dxa"/>
+              <w:right w:w="80" w:type="dxa"/>
+            </w:tcMar>
           </w:tcPr>
           <w:p>
+            <w:pPr>
+              <w:spacing w:after="60" w:before="40" w:line="245" w:lineRule="auto"/>
+            </w:pPr>
             <w:r>
-              <w:t>Замечание</w:t>
+              <w:rPr>
+                <w:rFonts w:ascii="Arial" w:hAnsi="Arial"/>
+                <w:b/>
+                <w:i w:val="0"/>
+                <w:color w:val="FFFFFF"/>
+                <w:sz w:val="18"/>
+              </w:rPr>
+              <w:t>Срок</w:t>
             </w:r>
           </w:p>
         </w:tc>
         <w:tc>
           <w:tcPr>
-            <w:tcW w:type="dxa" w:w="1728"/>
+            <w:tcW w:type="dxa" w:w="2438"/>
+            <w:vAlign w:val="center"/>
+            <w:shd w:fill="292C30"/>
+            <w:tcMar>
+              <w:top w:w="80" w:type="dxa"/>
+              <w:left w:w="80" w:type="dxa"/>
+              <w:bottom w:w="80" w:type="dxa"/>
+              <w:right w:w="80" w:type="dxa"/>
+            </w:tcMar>
           </w:tcPr>
           <w:p>
+            <w:pPr>
+              <w:spacing w:after="60" w:before="40" w:line="245" w:lineRule="auto"/>
+            </w:pPr>
             <w:r>
-              <w:t>Исполнитель</w:t>
+              <w:rPr>
+                <w:rFonts w:ascii="Arial" w:hAnsi="Arial"/>
+                <w:b/>
+                <w:i w:val="0"/>
+                <w:color w:val="FFFFFF"/>
+                <w:sz w:val="18"/>
+              </w:rPr>
+              <w:t>Повторная проверка: дата, ФИО, результат</w:t>
             </w:r>
           </w:p>
         </w:tc>
       </w:tr>
       <w:tr>
+        <w:trPr>
+          <w:cantSplit/>
+        </w:trPr>
         <w:tc>
           <w:tcPr>
-            <w:tcW w:type="dxa" w:w="1728"/>
+            <w:tcW w:type="dxa" w:w="964"/>
+            <w:vAlign w:val="center"/>
+            <w:shd w:fill="FFFFFF"/>
+            <w:tcMar>
+              <w:top w:w="80" w:type="dxa"/>
+              <w:left w:w="80" w:type="dxa"/>
+              <w:bottom w:w="80" w:type="dxa"/>
+              <w:right w:w="80" w:type="dxa"/>
+            </w:tcMar>
           </w:tcPr>
           <w:p>
+            <w:pPr>
+              <w:spacing w:after="60" w:before="40" w:line="245" w:lineRule="auto"/>
+            </w:pPr>
             <w:r>
+              <w:rPr>
+                <w:rFonts w:ascii="Arial" w:hAnsi="Arial"/>
+                <w:b w:val="0"/>
+                <w:i w:val="0"/>
+                <w:color w:val="292C30"/>
+                <w:sz w:val="18"/>
+              </w:rPr>
               <w:t>1</w:t>
             </w:r>
           </w:p>
         </w:tc>
         <w:tc>
           <w:tcPr>
-            <w:tcW w:type="dxa" w:w="1728"/>
+            <w:tcW w:type="dxa" w:w="3005"/>
+            <w:vAlign w:val="center"/>
+            <w:shd w:fill="FFFFFF"/>
+            <w:tcMar>
+              <w:top w:w="80" w:type="dxa"/>
+              <w:left w:w="80" w:type="dxa"/>
+              <w:bottom w:w="80" w:type="dxa"/>
+              <w:right w:w="80" w:type="dxa"/>
+            </w:tcMar>
           </w:tcPr>
           <w:p>
+            <w:pPr>
+              <w:spacing w:after="60" w:before="40" w:line="245" w:lineRule="auto"/>
+            </w:pPr>
             <w:r>
-              <w:t>Соответствие наименования объекта</w:t>
+              <w:rPr>
+                <w:rFonts w:ascii="Arial" w:hAnsi="Arial"/>
+                <w:b w:val="0"/>
+                <w:i w:val="0"/>
+                <w:color w:val="292C30"/>
+                <w:sz w:val="18"/>
+              </w:rPr>
+              <w:br/>
+              <w:br/>
             </w:r>
           </w:p>
         </w:tc>
         <w:tc>
           <w:tcPr>
-            <w:tcW w:type="dxa" w:w="1728"/>
+            <w:tcW w:type="dxa" w:w="2211"/>
+            <w:vAlign w:val="center"/>
+            <w:shd w:fill="FFFFFF"/>
+            <w:tcMar>
+              <w:top w:w="80" w:type="dxa"/>
+              <w:left w:w="80" w:type="dxa"/>
+              <w:bottom w:w="80" w:type="dxa"/>
+              <w:right w:w="80" w:type="dxa"/>
+            </w:tcMar>
           </w:tcPr>
           <w:p>
-            <w:r/>
+            <w:pPr>
+              <w:spacing w:after="60" w:before="40" w:line="245" w:lineRule="auto"/>
+            </w:pPr>
+            <w:r>
+              <w:rPr>
+                <w:rFonts w:ascii="Arial" w:hAnsi="Arial"/>
+                <w:b w:val="0"/>
+                <w:i w:val="0"/>
+                <w:color w:val="292C30"/>
+                <w:sz w:val="18"/>
+              </w:rPr>
+              <w:br/>
+              <w:br/>
+            </w:r>
           </w:p>
         </w:tc>
         <w:tc>
           <w:tcPr>
-            <w:tcW w:type="dxa" w:w="1728"/>
+            <w:tcW w:type="dxa" w:w="1247"/>
+            <w:vAlign w:val="center"/>
+            <w:shd w:fill="FFFFFF"/>
+            <w:tcMar>
+              <w:top w:w="80" w:type="dxa"/>
+              <w:left w:w="80" w:type="dxa"/>
+              <w:bottom w:w="80" w:type="dxa"/>
+              <w:right w:w="80" w:type="dxa"/>
+            </w:tcMar>
           </w:tcPr>
           <w:p>
-            <w:r/>
+            <w:pPr>
+              <w:spacing w:after="60" w:before="40" w:line="245" w:lineRule="auto"/>
+            </w:pPr>
+            <w:r>
+              <w:rPr>
+                <w:rFonts w:ascii="Arial" w:hAnsi="Arial"/>
+                <w:b w:val="0"/>
+                <w:i w:val="0"/>
+                <w:color w:val="292C30"/>
+                <w:sz w:val="18"/>
+              </w:rPr>
+            </w:r>
           </w:p>
         </w:tc>
         <w:tc>
           <w:tcPr>
-            <w:tcW w:type="dxa" w:w="1728"/>
+            <w:tcW w:type="dxa" w:w="2438"/>
+            <w:vAlign w:val="center"/>
+            <w:shd w:fill="FFFFFF"/>
+            <w:tcMar>
+              <w:top w:w="80" w:type="dxa"/>
+              <w:left w:w="80" w:type="dxa"/>
+              <w:bottom w:w="80" w:type="dxa"/>
+              <w:right w:w="80" w:type="dxa"/>
+            </w:tcMar>
           </w:tcPr>
           <w:p>
-            <w:r/>
+            <w:pPr>
+              <w:spacing w:after="60" w:before="40" w:line="245" w:lineRule="auto"/>
+            </w:pPr>
+            <w:r>
+              <w:rPr>
+                <w:rFonts w:ascii="Arial" w:hAnsi="Arial"/>
+                <w:b w:val="0"/>
+                <w:i w:val="0"/>
+                <w:color w:val="292C30"/>
+                <w:sz w:val="18"/>
+              </w:rPr>
+              <w:br/>
+              <w:br/>
+            </w:r>
           </w:p>
         </w:tc>
       </w:tr>
       <w:tr>
+        <w:trPr>
+          <w:cantSplit/>
+        </w:trPr>
         <w:tc>
           <w:tcPr>
-            <w:tcW w:type="dxa" w:w="1728"/>
+            <w:tcW w:type="dxa" w:w="964"/>
+            <w:vAlign w:val="center"/>
+            <w:shd w:fill="F6F4EF"/>
+            <w:tcMar>
+              <w:top w:w="80" w:type="dxa"/>
+              <w:left w:w="80" w:type="dxa"/>
+              <w:bottom w:w="80" w:type="dxa"/>
+              <w:right w:w="80" w:type="dxa"/>
+            </w:tcMar>
           </w:tcPr>
           <w:p>
+            <w:pPr>
+              <w:spacing w:after="60" w:before="40" w:line="245" w:lineRule="auto"/>
+            </w:pPr>
             <w:r>
+              <w:rPr>
+                <w:rFonts w:ascii="Arial" w:hAnsi="Arial"/>
+                <w:b w:val="0"/>
+                <w:i w:val="0"/>
+                <w:color w:val="292C30"/>
+                <w:sz w:val="18"/>
+              </w:rPr>
               <w:t>2</w:t>
             </w:r>
           </w:p>
         </w:tc>
         <w:tc>
           <w:tcPr>
-            <w:tcW w:type="dxa" w:w="1728"/>
+            <w:tcW w:type="dxa" w:w="3005"/>
+            <w:vAlign w:val="center"/>
+            <w:shd w:fill="F6F4EF"/>
+            <w:tcMar>
+              <w:top w:w="80" w:type="dxa"/>
+              <w:left w:w="80" w:type="dxa"/>
+              <w:bottom w:w="80" w:type="dxa"/>
+              <w:right w:w="80" w:type="dxa"/>
+            </w:tcMar>
           </w:tcPr>
           <w:p>
+            <w:pPr>
+              <w:spacing w:after="60" w:before="40" w:line="245" w:lineRule="auto"/>
+            </w:pPr>
             <w:r>
-              <w:t>Нумерация КС-2 (нет пропусков)</w:t>
+              <w:rPr>
+                <w:rFonts w:ascii="Arial" w:hAnsi="Arial"/>
+                <w:b w:val="0"/>
+                <w:i w:val="0"/>
+                <w:color w:val="292C30"/>
+                <w:sz w:val="18"/>
+              </w:rPr>
+              <w:br/>
+              <w:br/>
             </w:r>
           </w:p>
         </w:tc>
         <w:tc>
           <w:tcPr>
-            <w:tcW w:type="dxa" w:w="1728"/>
+            <w:tcW w:type="dxa" w:w="2211"/>
+            <w:vAlign w:val="center"/>
+            <w:shd w:fill="F6F4EF"/>
+            <w:tcMar>
+              <w:top w:w="80" w:type="dxa"/>
+              <w:left w:w="80" w:type="dxa"/>
+              <w:bottom w:w="80" w:type="dxa"/>
+              <w:right w:w="80" w:type="dxa"/>
+            </w:tcMar>
           </w:tcPr>
           <w:p>
-            <w:r/>
+            <w:pPr>
+              <w:spacing w:after="60" w:before="40" w:line="245" w:lineRule="auto"/>
+            </w:pPr>
+            <w:r>
+              <w:rPr>
+                <w:rFonts w:ascii="Arial" w:hAnsi="Arial"/>
+                <w:b w:val="0"/>
+                <w:i w:val="0"/>
+                <w:color w:val="292C30"/>
+                <w:sz w:val="18"/>
+              </w:rPr>
+              <w:br/>
+              <w:br/>
+            </w:r>
           </w:p>
         </w:tc>
         <w:tc>
           <w:tcPr>
-            <w:tcW w:type="dxa" w:w="1728"/>
+            <w:tcW w:type="dxa" w:w="1247"/>
+            <w:vAlign w:val="center"/>
+            <w:shd w:fill="F6F4EF"/>
+            <w:tcMar>
+              <w:top w:w="80" w:type="dxa"/>
+              <w:left w:w="80" w:type="dxa"/>
+              <w:bottom w:w="80" w:type="dxa"/>
+              <w:right w:w="80" w:type="dxa"/>
+            </w:tcMar>
           </w:tcPr>
           <w:p>
-            <w:r/>
+            <w:pPr>
+              <w:spacing w:after="60" w:before="40" w:line="245" w:lineRule="auto"/>
+            </w:pPr>
+            <w:r>
+              <w:rPr>
+                <w:rFonts w:ascii="Arial" w:hAnsi="Arial"/>
+                <w:b w:val="0"/>
+                <w:i w:val="0"/>
+                <w:color w:val="292C30"/>
+                <w:sz w:val="18"/>
+              </w:rPr>
+            </w:r>
           </w:p>
         </w:tc>
         <w:tc>
           <w:tcPr>
-            <w:tcW w:type="dxa" w:w="1728"/>
+            <w:tcW w:type="dxa" w:w="2438"/>
+            <w:vAlign w:val="center"/>
+            <w:shd w:fill="F6F4EF"/>
+            <w:tcMar>
+              <w:top w:w="80" w:type="dxa"/>
+              <w:left w:w="80" w:type="dxa"/>
+              <w:bottom w:w="80" w:type="dxa"/>
+              <w:right w:w="80" w:type="dxa"/>
+            </w:tcMar>
           </w:tcPr>
           <w:p>
-            <w:r/>
+            <w:pPr>
+              <w:spacing w:after="60" w:before="40" w:line="245" w:lineRule="auto"/>
+            </w:pPr>
+            <w:r>
+              <w:rPr>
+                <w:rFonts w:ascii="Arial" w:hAnsi="Arial"/>
+                <w:b w:val="0"/>
+                <w:i w:val="0"/>
+                <w:color w:val="292C30"/>
+                <w:sz w:val="18"/>
+              </w:rPr>
+              <w:br/>
+              <w:br/>
+            </w:r>
           </w:p>
         </w:tc>
       </w:tr>
       <w:tr>
+        <w:trPr>
+          <w:cantSplit/>
+        </w:trPr>
         <w:tc>
           <w:tcPr>
-            <w:tcW w:type="dxa" w:w="1728"/>
+            <w:tcW w:type="dxa" w:w="964"/>
+            <w:vAlign w:val="center"/>
+            <w:shd w:fill="FFFFFF"/>
+            <w:tcMar>
+              <w:top w:w="80" w:type="dxa"/>
+              <w:left w:w="80" w:type="dxa"/>
+              <w:bottom w:w="80" w:type="dxa"/>
+              <w:right w:w="80" w:type="dxa"/>
+            </w:tcMar>
           </w:tcPr>
           <w:p>
+            <w:pPr>
+              <w:spacing w:after="60" w:before="40" w:line="245" w:lineRule="auto"/>
+            </w:pPr>
             <w:r>
+              <w:rPr>
+                <w:rFonts w:ascii="Arial" w:hAnsi="Arial"/>
+                <w:b w:val="0"/>
+                <w:i w:val="0"/>
+                <w:color w:val="292C30"/>
+                <w:sz w:val="18"/>
+              </w:rPr>
               <w:t>3</w:t>
             </w:r>
           </w:p>
         </w:tc>
         <w:tc>
           <w:tcPr>
-            <w:tcW w:type="dxa" w:w="1728"/>
+            <w:tcW w:type="dxa" w:w="3005"/>
+            <w:vAlign w:val="center"/>
+            <w:shd w:fill="FFFFFF"/>
+            <w:tcMar>
+              <w:top w:w="80" w:type="dxa"/>
+              <w:left w:w="80" w:type="dxa"/>
+              <w:bottom w:w="80" w:type="dxa"/>
+              <w:right w:w="80" w:type="dxa"/>
+            </w:tcMar>
           </w:tcPr>
           <w:p>
+            <w:pPr>
+              <w:spacing w:after="60" w:before="40" w:line="245" w:lineRule="auto"/>
+            </w:pPr>
             <w:r>
-              <w:t>Соответствие сумм КС-2 и КС-3</w:t>
+              <w:rPr>
+                <w:rFonts w:ascii="Arial" w:hAnsi="Arial"/>
+                <w:b w:val="0"/>
+                <w:i w:val="0"/>
+                <w:color w:val="292C30"/>
+                <w:sz w:val="18"/>
+              </w:rPr>
+              <w:br/>
+              <w:br/>
             </w:r>
           </w:p>
         </w:tc>
         <w:tc>
           <w:tcPr>
-            <w:tcW w:type="dxa" w:w="1728"/>
+            <w:tcW w:type="dxa" w:w="2211"/>
+            <w:vAlign w:val="center"/>
+            <w:shd w:fill="FFFFFF"/>
+            <w:tcMar>
+              <w:top w:w="80" w:type="dxa"/>
+              <w:left w:w="80" w:type="dxa"/>
+              <w:bottom w:w="80" w:type="dxa"/>
+              <w:right w:w="80" w:type="dxa"/>
+            </w:tcMar>
           </w:tcPr>
           <w:p>
-            <w:r/>
+            <w:pPr>
+              <w:spacing w:after="60" w:before="40" w:line="245" w:lineRule="auto"/>
+            </w:pPr>
+            <w:r>
+              <w:rPr>
+                <w:rFonts w:ascii="Arial" w:hAnsi="Arial"/>
+                <w:b w:val="0"/>
+                <w:i w:val="0"/>
+                <w:color w:val="292C30"/>
+                <w:sz w:val="18"/>
+              </w:rPr>
+              <w:br/>
+              <w:br/>
+            </w:r>
           </w:p>
         </w:tc>
         <w:tc>
           <w:tcPr>
-            <w:tcW w:type="dxa" w:w="1728"/>
+            <w:tcW w:type="dxa" w:w="1247"/>
+            <w:vAlign w:val="center"/>
+            <w:shd w:fill="FFFFFF"/>
+            <w:tcMar>
+              <w:top w:w="80" w:type="dxa"/>
+              <w:left w:w="80" w:type="dxa"/>
+              <w:bottom w:w="80" w:type="dxa"/>
+              <w:right w:w="80" w:type="dxa"/>
+            </w:tcMar>
           </w:tcPr>
           <w:p>
-            <w:r/>
+            <w:pPr>
+              <w:spacing w:after="60" w:before="40" w:line="245" w:lineRule="auto"/>
+            </w:pPr>
+            <w:r>
+              <w:rPr>
+                <w:rFonts w:ascii="Arial" w:hAnsi="Arial"/>
+                <w:b w:val="0"/>
+                <w:i w:val="0"/>
+                <w:color w:val="292C30"/>
+                <w:sz w:val="18"/>
+              </w:rPr>
+            </w:r>
           </w:p>
         </w:tc>
         <w:tc>
           <w:tcPr>
-            <w:tcW w:type="dxa" w:w="1728"/>
+            <w:tcW w:type="dxa" w:w="2438"/>
+            <w:vAlign w:val="center"/>
+            <w:shd w:fill="FFFFFF"/>
+            <w:tcMar>
+              <w:top w:w="80" w:type="dxa"/>
+              <w:left w:w="80" w:type="dxa"/>
+              <w:bottom w:w="80" w:type="dxa"/>
+              <w:right w:w="80" w:type="dxa"/>
+            </w:tcMar>
           </w:tcPr>
           <w:p>
-            <w:r/>
+            <w:pPr>
+              <w:spacing w:after="60" w:before="40" w:line="245" w:lineRule="auto"/>
+            </w:pPr>
+            <w:r>
+              <w:rPr>
+                <w:rFonts w:ascii="Arial" w:hAnsi="Arial"/>
+                <w:b w:val="0"/>
+                <w:i w:val="0"/>
+                <w:color w:val="292C30"/>
+                <w:sz w:val="18"/>
+              </w:rPr>
+              <w:br/>
+              <w:br/>
+            </w:r>
           </w:p>
         </w:tc>
       </w:tr>
       <w:tr>
+        <w:trPr>
+          <w:cantSplit/>
+        </w:trPr>
         <w:tc>
           <w:tcPr>
-            <w:tcW w:type="dxa" w:w="1728"/>
+            <w:tcW w:type="dxa" w:w="964"/>
+            <w:vAlign w:val="center"/>
+            <w:shd w:fill="F6F4EF"/>
+            <w:tcMar>
+              <w:top w:w="80" w:type="dxa"/>
+              <w:left w:w="80" w:type="dxa"/>
+              <w:bottom w:w="80" w:type="dxa"/>
+              <w:right w:w="80" w:type="dxa"/>
+            </w:tcMar>
           </w:tcPr>
           <w:p>
+            <w:pPr>
+              <w:spacing w:after="60" w:before="40" w:line="245" w:lineRule="auto"/>
+            </w:pPr>
             <w:r>
+              <w:rPr>
+                <w:rFonts w:ascii="Arial" w:hAnsi="Arial"/>
+                <w:b w:val="0"/>
+                <w:i w:val="0"/>
+                <w:color w:val="292C30"/>
+                <w:sz w:val="18"/>
+              </w:rPr>
               <w:t>4</w:t>
             </w:r>
           </w:p>
         </w:tc>
         <w:tc>
           <w:tcPr>
-            <w:tcW w:type="dxa" w:w="1728"/>
+            <w:tcW w:type="dxa" w:w="3005"/>
+            <w:vAlign w:val="center"/>
+            <w:shd w:fill="F6F4EF"/>
+            <w:tcMar>
+              <w:top w:w="80" w:type="dxa"/>
+              <w:left w:w="80" w:type="dxa"/>
+              <w:bottom w:w="80" w:type="dxa"/>
+              <w:right w:w="80" w:type="dxa"/>
+            </w:tcMar>
           </w:tcPr>
           <w:p>
+            <w:pPr>
+              <w:spacing w:after="60" w:before="40" w:line="245" w:lineRule="auto"/>
+            </w:pPr>
             <w:r>
-              <w:t>Наличие всех подписей</w:t>
+              <w:rPr>
+                <w:rFonts w:ascii="Arial" w:hAnsi="Arial"/>
+                <w:b w:val="0"/>
+                <w:i w:val="0"/>
+                <w:color w:val="292C30"/>
+                <w:sz w:val="18"/>
+              </w:rPr>
+              <w:br/>
+              <w:br/>
             </w:r>
           </w:p>
         </w:tc>
         <w:tc>
           <w:tcPr>
-            <w:tcW w:type="dxa" w:w="1728"/>
+            <w:tcW w:type="dxa" w:w="2211"/>
+            <w:vAlign w:val="center"/>
+            <w:shd w:fill="F6F4EF"/>
+            <w:tcMar>
+              <w:top w:w="80" w:type="dxa"/>
+              <w:left w:w="80" w:type="dxa"/>
+              <w:bottom w:w="80" w:type="dxa"/>
+              <w:right w:w="80" w:type="dxa"/>
+            </w:tcMar>
           </w:tcPr>
           <w:p>
-            <w:r/>
-          </w:p>
-        </w:tc>
-        <w:tc>
-          <w:tcPr>
-            <w:tcW w:type="dxa" w:w="1728"/>
-          </w:tcPr>
-          <w:p>
-            <w:r/>
-          </w:p>
-        </w:tc>
-        <w:tc>
-          <w:tcPr>
-            <w:tcW w:type="dxa" w:w="1728"/>
-          </w:tcPr>
-          <w:p>
-            <w:r/>
-          </w:p>
-        </w:tc>
-      </w:tr>
-      <w:tr>
-        <w:tc>
-          <w:tcPr>
-            <w:tcW w:type="dxa" w:w="1728"/>
-          </w:tcPr>
-          <w:p>
+            <w:pPr>
+              <w:spacing w:after="60" w:before="40" w:line="245" w:lineRule="auto"/>
+            </w:pPr>
             <w:r>
-              <w:t>5</w:t>
+              <w:rPr>
+                <w:rFonts w:ascii="Arial" w:hAnsi="Arial"/>
+                <w:b w:val="0"/>
+                <w:i w:val="0"/>
+                <w:color w:val="292C30"/>
+                <w:sz w:val="18"/>
+              </w:rPr>
+              <w:br/>
+              <w:br/>
             </w:r>
           </w:p>
         </w:tc>
         <w:tc>
           <w:tcPr>
-            <w:tcW w:type="dxa" w:w="1728"/>
+            <w:tcW w:type="dxa" w:w="1247"/>
+            <w:vAlign w:val="center"/>
+            <w:shd w:fill="F6F4EF"/>
+            <w:tcMar>
+              <w:top w:w="80" w:type="dxa"/>
+              <w:left w:w="80" w:type="dxa"/>
+              <w:bottom w:w="80" w:type="dxa"/>
+              <w:right w:w="80" w:type="dxa"/>
+            </w:tcMar>
           </w:tcPr>
           <w:p>
+            <w:pPr>
+              <w:spacing w:after="60" w:before="40" w:line="245" w:lineRule="auto"/>
+            </w:pPr>
             <w:r>
-              <w:t>Полнота приложений</w:t>
+              <w:rPr>
+                <w:rFonts w:ascii="Arial" w:hAnsi="Arial"/>
+                <w:b w:val="0"/>
+                <w:i w:val="0"/>
+                <w:color w:val="292C30"/>
+                <w:sz w:val="18"/>
+              </w:rPr>
             </w:r>
           </w:p>
         </w:tc>
         <w:tc>
           <w:tcPr>
-            <w:tcW w:type="dxa" w:w="1728"/>
+            <w:tcW w:type="dxa" w:w="2438"/>
+            <w:vAlign w:val="center"/>
+            <w:shd w:fill="F6F4EF"/>
+            <w:tcMar>
+              <w:top w:w="80" w:type="dxa"/>
+              <w:left w:w="80" w:type="dxa"/>
+              <w:bottom w:w="80" w:type="dxa"/>
+              <w:right w:w="80" w:type="dxa"/>
+            </w:tcMar>
           </w:tcPr>
           <w:p>
-            <w:r/>
-          </w:p>
-        </w:tc>
-        <w:tc>
-          <w:tcPr>
-            <w:tcW w:type="dxa" w:w="1728"/>
-          </w:tcPr>
-          <w:p>
-            <w:r/>
-          </w:p>
-        </w:tc>
-        <w:tc>
-          <w:tcPr>
-            <w:tcW w:type="dxa" w:w="1728"/>
-          </w:tcPr>
-          <w:p>
-            <w:r/>
-          </w:p>
-        </w:tc>
-      </w:tr>
-      <w:tr>
-        <w:tc>
-          <w:tcPr>
-            <w:tcW w:type="dxa" w:w="1728"/>
-          </w:tcPr>
-          <w:p>
+            <w:pPr>
+              <w:spacing w:after="60" w:before="40" w:line="245" w:lineRule="auto"/>
+            </w:pPr>
             <w:r>
-              <w:t>6</w:t>
+              <w:rPr>
+                <w:rFonts w:ascii="Arial" w:hAnsi="Arial"/>
+                <w:b w:val="0"/>
+                <w:i w:val="0"/>
+                <w:color w:val="292C30"/>
+                <w:sz w:val="18"/>
+              </w:rPr>
+              <w:br/>
+              <w:br/>
             </w:r>
-          </w:p>
-        </w:tc>
-        <w:tc>
-          <w:tcPr>
-            <w:tcW w:type="dxa" w:w="1728"/>
-          </w:tcPr>
-          <w:p>
-            <w:r>
-              <w:t>Действительность сертификатов</w:t>
-            </w:r>
-          </w:p>
-        </w:tc>
-        <w:tc>
-          <w:tcPr>
-            <w:tcW w:type="dxa" w:w="1728"/>
-          </w:tcPr>
-          <w:p>
-            <w:r/>
-          </w:p>
-        </w:tc>
-        <w:tc>
-          <w:tcPr>
-            <w:tcW w:type="dxa" w:w="1728"/>
-          </w:tcPr>
-          <w:p>
-            <w:r/>
-          </w:p>
-        </w:tc>
-        <w:tc>
-          <w:tcPr>
-            <w:tcW w:type="dxa" w:w="1728"/>
-          </w:tcPr>
-          <w:p>
-            <w:r/>
-          </w:p>
-        </w:tc>
-      </w:tr>
-      <w:tr>
-        <w:tc>
-          <w:tcPr>
-            <w:tcW w:type="dxa" w:w="1728"/>
-          </w:tcPr>
-          <w:p>
-            <w:r>
-              <w:t>7</w:t>
-            </w:r>
-          </w:p>
-        </w:tc>
-        <w:tc>
-          <w:tcPr>
-            <w:tcW w:type="dxa" w:w="1728"/>
-          </w:tcPr>
-          <w:p>
-            <w:r>
-              <w:t>Соответствие исполнительных схем</w:t>
-            </w:r>
-          </w:p>
-        </w:tc>
-        <w:tc>
-          <w:tcPr>
-            <w:tcW w:type="dxa" w:w="1728"/>
-          </w:tcPr>
-          <w:p>
-            <w:r/>
-          </w:p>
-        </w:tc>
-        <w:tc>
-          <w:tcPr>
-            <w:tcW w:type="dxa" w:w="1728"/>
-          </w:tcPr>
-          <w:p>
-            <w:r/>
-          </w:p>
-        </w:tc>
-        <w:tc>
-          <w:tcPr>
-            <w:tcW w:type="dxa" w:w="1728"/>
-          </w:tcPr>
-          <w:p>
-            <w:r/>
-          </w:p>
-        </w:tc>
-      </w:tr>
-      <w:tr>
-        <w:tc>
-          <w:tcPr>
-            <w:tcW w:type="dxa" w:w="1728"/>
-          </w:tcPr>
-          <w:p>
-            <w:r>
-              <w:t>8</w:t>
-            </w:r>
-          </w:p>
-        </w:tc>
-        <w:tc>
-          <w:tcPr>
-            <w:tcW w:type="dxa" w:w="1728"/>
-          </w:tcPr>
-          <w:p>
-            <w:r>
-              <w:t>Акты скрытых работ (полнота, подписи)</w:t>
-            </w:r>
-          </w:p>
-        </w:tc>
-        <w:tc>
-          <w:tcPr>
-            <w:tcW w:type="dxa" w:w="1728"/>
-          </w:tcPr>
-          <w:p>
-            <w:r/>
-          </w:p>
-        </w:tc>
-        <w:tc>
-          <w:tcPr>
-            <w:tcW w:type="dxa" w:w="1728"/>
-          </w:tcPr>
-          <w:p>
-            <w:r/>
-          </w:p>
-        </w:tc>
-        <w:tc>
-          <w:tcPr>
-            <w:tcW w:type="dxa" w:w="1728"/>
-          </w:tcPr>
-          <w:p>
-            <w:r/>
           </w:p>
         </w:tc>
       </w:tr>
     </w:tbl>
-    <w:p/>
-    <w:p/>
     <w:p>
+      <w:pPr>
+        <w:spacing w:after="100"/>
+      </w:pPr>
       <w:r>
-        <w:t>ЗАКЛЮЧЕНИЕ КОМИССИИ:</w:t>
+        <w:rPr>
+          <w:b w:val="0"/>
+          <w:i w:val="0"/>
+          <w:sz w:val="18"/>
+        </w:rPr>
+        <w:t>Для каждого замечания сохраните ссылку на исправленный документ. При нехватке места продолжите таблицу с общей нумерацией.</w:t>
       </w:r>
     </w:p>
     <w:p>
+      <w:pPr>
+        <w:pStyle w:val="Heading2"/>
+      </w:pPr>
       <w:r>
-        <w:t>☐ Комплект соответствует требованиям, к передаче заказчику разрешается.</w:t>
+        <w:t>Решение по комплекту</w:t>
       </w:r>
     </w:p>
     <w:p>
+      <w:pPr>
+        <w:spacing w:after="100"/>
+      </w:pPr>
       <w:r>
-        <w:t>☐ Комплект содержит замечания, требуется доработка (см. таблицу).</w:t>
-      </w:r>
-    </w:p>
-    <w:p/>
-    <w:p>
-      <w:r>
-        <w:t>Председатель комиссии _________________ / _________________________ /</w:t>
+        <w:rPr>
+          <w:b w:val="0"/>
+          <w:i w:val="0"/>
+          <w:sz w:val="20"/>
+        </w:rPr>
+        <w:t>Открытых замечаний: ______. Результат реестра №02: ____________________</w:t>
       </w:r>
     </w:p>
     <w:p>
+      <w:pPr>
+        <w:spacing w:after="100"/>
+      </w:pPr>
       <w:r>
-        <w:t>Члены комиссии         _________________ / _________________________ /</w:t>
+        <w:rPr>
+          <w:b w:val="0"/>
+          <w:i w:val="0"/>
+          <w:sz w:val="20"/>
+        </w:rPr>
+        <w:t>□ Готов к передаче: обязательные приложения проверены, замечания закрыты.</w:t>
+        <w:br/>
+        <w:t>□ Доработать: передача на приёмку после устранения указанных замечаний.</w:t>
       </w:r>
     </w:p>
     <w:p>
+      <w:pPr>
+        <w:spacing w:after="100"/>
+      </w:pPr>
       <w:r>
-        <w:t xml:space="preserve">                       _________________ / _________________________ /</w:t>
+        <w:rPr>
+          <w:b w:val="0"/>
+          <w:i w:val="0"/>
+          <w:sz w:val="20"/>
+        </w:rPr>
+        <w:t>Ответственный за передачу __________________  Плановая дата __________</w:t>
+      </w:r>
+    </w:p>
+    <w:p>
+      <w:pPr>
+        <w:spacing w:after="100"/>
+      </w:pPr>
+      <w:r>
+        <w:rPr>
+          <w:b w:val="0"/>
+          <w:i w:val="0"/>
+          <w:sz w:val="20"/>
+        </w:rPr>
+        <w:t>Проверяющий __________________ / __________________ /  Дата __________</w:t>
+      </w:r>
+    </w:p>
+    <w:p>
+      <w:pPr>
+        <w:spacing w:after="100"/>
+      </w:pPr>
+      <w:r>
+        <w:rPr>
+          <w:b w:val="0"/>
+          <w:i w:val="0"/>
+          <w:sz w:val="20"/>
+        </w:rPr>
+        <w:t>Повторно принято __________________ / __________________ /  Дата ______</w:t>
       </w:r>
     </w:p>
     <w:sectPr>
-      <w:pgSz w:w="12240" w:h="15840"/>
-      <w:pgMar w:top="1440" w:right="1800" w:bottom="1440" w:left="1800" w:header="720" w:footer="720" w:gutter="0"/>
+      <w:headerReference w:type="default" r:id="rId9"/>
+      <w:footerReference w:type="default" r:id="rId10"/>
+      <w:pgSz w:w="11906" w:h="16838"/>
+      <w:pgMar w:top="964" w:right="1020" w:bottom="907" w:left="1020" w:header="397" w:footer="454" w:gutter="0"/>
       <w:cols w:space="720"/>
       <w:docGrid w:linePitch="360"/>
     </w:sectPr>
   </w:body>
 </w:document>
+</file>
+
+<file path=word/footer1.xml><?xml version="1.0" encoding="utf-8"?>
+<w:ftr xmlns:m="http://schemas.openxmlformats.org/officeDocument/2006/math" xmlns:mc="http://schemas.openxmlformats.org/markup-compatibility/2006" xmlns:mo="http://schemas.microsoft.com/office/mac/office/2008/main" xmlns:mv="urn:schemas-microsoft-com:mac:vml" xmlns:o="urn:schemas-microsoft-com:office:office" xmlns:r="http://schemas.openxmlformats.org/officeDocument/2006/relationships" xmlns:v="urn:schemas-microsoft-com:vml" xmlns:w10="urn:schemas-microsoft-com:office:word" xmlns:w14="http://schemas.microsoft.com/office/word/2010/wordml" xmlns:w="http://schemas.openxmlformats.org/wordprocessingml/2006/main" xmlns:wne="http://schemas.microsoft.com/office/word/2006/wordml" xmlns:wp14="http://schemas.microsoft.com/office/word/2010/wordprocessingDrawing" xmlns:wp="http://schemas.openxmlformats.org/drawingml/2006/wordprocessingDrawing" xmlns:wpc="http://schemas.microsoft.com/office/word/2010/wordprocessingCanvas" xmlns:wpg="http://schemas.microsoft.com/office/word/2010/wordprocessingGroup" xmlns:wpi="http://schemas.microsoft.com/office/word/2010/wordprocessingInk" xmlns:wps="http://schemas.microsoft.com/office/word/2010/wordprocessingShape" mc:Ignorable="w14 wp14">
+  <w:p>
+    <w:pPr>
+      <w:pStyle w:val="Footer"/>
+    </w:pPr>
+    <w:r>
+      <w:rPr>
+        <w:b w:val="0"/>
+        <w:i w:val="0"/>
+        <w:sz w:val="16"/>
+      </w:rPr>
+      <w:t xml:space="preserve">КС-2 / КС-3 • Протокол    |    </w:t>
+    </w:r>
+    <w:fldSimple w:instr="PAGE"/>
+  </w:p>
+</w:ftr>
+</file>
+
+<file path=word/header1.xml><?xml version="1.0" encoding="utf-8"?>
+<w:hdr xmlns:m="http://schemas.openxmlformats.org/officeDocument/2006/math" xmlns:mc="http://schemas.openxmlformats.org/markup-compatibility/2006" xmlns:mo="http://schemas.microsoft.com/office/mac/office/2008/main" xmlns:mv="urn:schemas-microsoft-com:mac:vml" xmlns:o="urn:schemas-microsoft-com:office:office" xmlns:r="http://schemas.openxmlformats.org/officeDocument/2006/relationships" xmlns:v="urn:schemas-microsoft-com:vml" xmlns:w10="urn:schemas-microsoft-com:office:word" xmlns:w14="http://schemas.microsoft.com/office/word/2010/wordml" xmlns:w="http://schemas.openxmlformats.org/wordprocessingml/2006/main" xmlns:wne="http://schemas.microsoft.com/office/word/2006/wordml" xmlns:wp14="http://schemas.microsoft.com/office/word/2010/wordprocessingDrawing" xmlns:wp="http://schemas.openxmlformats.org/drawingml/2006/wordprocessingDrawing" xmlns:wpc="http://schemas.microsoft.com/office/word/2010/wordprocessingCanvas" xmlns:wpg="http://schemas.microsoft.com/office/word/2010/wordprocessingGroup" xmlns:wpi="http://schemas.microsoft.com/office/word/2010/wordprocessingInk" xmlns:wps="http://schemas.microsoft.com/office/word/2010/wordprocessingShape" mc:Ignorable="w14 wp14">
+  <w:p>
+    <w:pPr>
+      <w:pStyle w:val="Header"/>
+      <w:pBdr>
+        <w:bottom w:val="single" w:sz="9" w:color="AC9568" w:space="4"/>
+      </w:pBdr>
+    </w:pPr>
+    <w:r>
+      <w:rPr>
+        <w:b/>
+        <w:i w:val="0"/>
+        <w:sz w:val="16"/>
+      </w:rPr>
+      <w:t>МАРЖА В БЕТОНЕ  /  P3</w:t>
+    </w:r>
+  </w:p>
+</w:hdr>
 </file>
 
 <file path=word/numbering.xml><?xml version="1.0" encoding="utf-8"?>
@@ -914,6 +1335,15 @@
     <w:name w:val="Normal"/>
     <w:qFormat/>
     <w:rsid w:val="00FC693F"/>
+    <w:pPr>
+      <w:spacing w:line="254" w:lineRule="auto" w:after="100"/>
+    </w:pPr>
+    <w:rPr>
+      <w:rFonts w:ascii="Arial" w:hAnsi="Arial"/>
+      <w:i w:val="0"/>
+      <w:color w:val="292C30"/>
+      <w:sz w:val="20"/>
+    </w:rPr>
   </w:style>
   <w:style w:type="paragraph" w:styleId="Header">
     <w:name w:val="header"/>
@@ -929,6 +1359,11 @@
       </w:tabs>
       <w:spacing w:after="0" w:line="240" w:lineRule="auto"/>
     </w:pPr>
+    <w:rPr>
+      <w:rFonts w:ascii="Arial" w:hAnsi="Arial"/>
+      <w:i w:val="0"/>
+      <w:color w:val="292C30"/>
+    </w:rPr>
   </w:style>
   <w:style w:type="character" w:customStyle="1" w:styleId="HeaderChar">
     <w:name w:val="Header Char"/>
@@ -936,6 +1371,11 @@
     <w:link w:val="Header"/>
     <w:uiPriority w:val="99"/>
     <w:rsid w:val="00E618BF"/>
+    <w:rPr>
+      <w:rFonts w:ascii="Arial" w:hAnsi="Arial"/>
+      <w:i w:val="0"/>
+      <w:color w:val="292C30"/>
+    </w:rPr>
   </w:style>
   <w:style w:type="paragraph" w:styleId="Footer">
     <w:name w:val="footer"/>
@@ -951,6 +1391,11 @@
       </w:tabs>
       <w:spacing w:after="0" w:line="240" w:lineRule="auto"/>
     </w:pPr>
+    <w:rPr>
+      <w:rFonts w:ascii="Arial" w:hAnsi="Arial"/>
+      <w:i w:val="0"/>
+      <w:color w:val="292C30"/>
+    </w:rPr>
   </w:style>
   <w:style w:type="character" w:customStyle="1" w:styleId="FooterChar">
     <w:name w:val="Footer Char"/>
@@ -958,6 +1403,11 @@
     <w:link w:val="Footer"/>
     <w:uiPriority w:val="99"/>
     <w:rsid w:val="00E618BF"/>
+    <w:rPr>
+      <w:rFonts w:ascii="Arial" w:hAnsi="Arial"/>
+      <w:i w:val="0"/>
+      <w:color w:val="292C30"/>
+    </w:rPr>
   </w:style>
   <w:style w:type="paragraph" w:styleId="Heading1">
     <w:name w:val="heading 1"/>
@@ -970,15 +1420,16 @@
     <w:pPr>
       <w:keepNext/>
       <w:keepLines/>
-      <w:spacing w:before="480" w:after="0"/>
+      <w:spacing w:before="140" w:after="100"/>
       <w:outlineLvl w:val="0"/>
     </w:pPr>
     <w:rPr>
-      <w:rFonts w:asciiTheme="majorHAnsi" w:eastAsiaTheme="majorEastAsia" w:hAnsiTheme="majorHAnsi" w:cstheme="majorBidi"/>
+      <w:rFonts w:asciiTheme="majorHAnsi" w:eastAsiaTheme="majorEastAsia" w:hAnsiTheme="majorHAnsi" w:cstheme="majorBidi" w:ascii="Arial" w:hAnsi="Arial"/>
       <w:b/>
       <w:bCs/>
-      <w:color w:val="365F91" w:themeColor="accent1" w:themeShade="BF"/>
-      <w:sz w:val="28"/>
+      <w:i w:val="0"/>
+      <w:color w:val="292C30"/>
+      <w:sz w:val="26"/>
       <w:szCs w:val="28"/>
     </w:rPr>
   </w:style>
@@ -994,15 +1445,16 @@
     <w:pPr>
       <w:keepNext/>
       <w:keepLines/>
-      <w:spacing w:before="200" w:after="0"/>
+      <w:spacing w:before="140" w:after="100"/>
       <w:outlineLvl w:val="1"/>
     </w:pPr>
     <w:rPr>
-      <w:rFonts w:asciiTheme="majorHAnsi" w:eastAsiaTheme="majorEastAsia" w:hAnsiTheme="majorHAnsi" w:cstheme="majorBidi"/>
+      <w:rFonts w:asciiTheme="majorHAnsi" w:eastAsiaTheme="majorEastAsia" w:hAnsiTheme="majorHAnsi" w:cstheme="majorBidi" w:ascii="Arial" w:hAnsi="Arial"/>
       <w:b/>
       <w:bCs/>
-      <w:color w:val="4F81BD" w:themeColor="accent1"/>
-      <w:sz w:val="26"/>
+      <w:i w:val="0"/>
+      <w:color w:val="292C30"/>
+      <w:sz w:val="22"/>
       <w:szCs w:val="26"/>
     </w:rPr>
   </w:style>
@@ -1022,10 +1474,11 @@
       <w:outlineLvl w:val="2"/>
     </w:pPr>
     <w:rPr>
-      <w:rFonts w:asciiTheme="majorHAnsi" w:eastAsiaTheme="majorEastAsia" w:hAnsiTheme="majorHAnsi" w:cstheme="majorBidi"/>
+      <w:rFonts w:asciiTheme="majorHAnsi" w:eastAsiaTheme="majorEastAsia" w:hAnsiTheme="majorHAnsi" w:cstheme="majorBidi" w:ascii="Arial" w:hAnsi="Arial"/>
       <w:b/>
       <w:bCs/>
-      <w:color w:val="4F81BD" w:themeColor="accent1"/>
+      <w:i w:val="0"/>
+      <w:color w:val="292C30"/>
     </w:rPr>
   </w:style>
   <w:style w:type="paragraph" w:styleId="Heading4">
@@ -1045,12 +1498,12 @@
       <w:outlineLvl w:val="3"/>
     </w:pPr>
     <w:rPr>
-      <w:rFonts w:asciiTheme="majorHAnsi" w:eastAsiaTheme="majorEastAsia" w:hAnsiTheme="majorHAnsi" w:cstheme="majorBidi"/>
+      <w:rFonts w:asciiTheme="majorHAnsi" w:eastAsiaTheme="majorEastAsia" w:hAnsiTheme="majorHAnsi" w:cstheme="majorBidi" w:ascii="Arial" w:hAnsi="Arial"/>
       <w:b/>
       <w:bCs/>
-      <w:i/>
-      <w:iCs/>
-      <w:color w:val="4F81BD" w:themeColor="accent1"/>
+      <w:i w:val="0"/>
+      <w:iCs w:val="0"/>
+      <w:color w:val="292C30"/>
     </w:rPr>
   </w:style>
   <w:style w:type="paragraph" w:styleId="Heading5">
@@ -1070,8 +1523,9 @@
       <w:outlineLvl w:val="4"/>
     </w:pPr>
     <w:rPr>
-      <w:rFonts w:asciiTheme="majorHAnsi" w:eastAsiaTheme="majorEastAsia" w:hAnsiTheme="majorHAnsi" w:cstheme="majorBidi"/>
-      <w:color w:val="243F60" w:themeColor="accent1" w:themeShade="7F"/>
+      <w:rFonts w:asciiTheme="majorHAnsi" w:eastAsiaTheme="majorEastAsia" w:hAnsiTheme="majorHAnsi" w:cstheme="majorBidi" w:ascii="Arial" w:hAnsi="Arial"/>
+      <w:i w:val="0"/>
+      <w:color w:val="292C30"/>
     </w:rPr>
   </w:style>
   <w:style w:type="paragraph" w:styleId="Heading6">
@@ -1091,10 +1545,10 @@
       <w:outlineLvl w:val="5"/>
     </w:pPr>
     <w:rPr>
-      <w:rFonts w:asciiTheme="majorHAnsi" w:eastAsiaTheme="majorEastAsia" w:hAnsiTheme="majorHAnsi" w:cstheme="majorBidi"/>
-      <w:i/>
-      <w:iCs/>
-      <w:color w:val="243F60" w:themeColor="accent1" w:themeShade="7F"/>
+      <w:rFonts w:asciiTheme="majorHAnsi" w:eastAsiaTheme="majorEastAsia" w:hAnsiTheme="majorHAnsi" w:cstheme="majorBidi" w:ascii="Arial" w:hAnsi="Arial"/>
+      <w:i w:val="0"/>
+      <w:iCs w:val="0"/>
+      <w:color w:val="292C30"/>
     </w:rPr>
   </w:style>
   <w:style w:type="paragraph" w:styleId="Heading7">
@@ -1114,10 +1568,10 @@
       <w:outlineLvl w:val="6"/>
     </w:pPr>
     <w:rPr>
-      <w:rFonts w:asciiTheme="majorHAnsi" w:eastAsiaTheme="majorEastAsia" w:hAnsiTheme="majorHAnsi" w:cstheme="majorBidi"/>
-      <w:i/>
-      <w:iCs/>
-      <w:color w:val="404040" w:themeColor="text1" w:themeTint="BF"/>
+      <w:rFonts w:asciiTheme="majorHAnsi" w:eastAsiaTheme="majorEastAsia" w:hAnsiTheme="majorHAnsi" w:cstheme="majorBidi" w:ascii="Arial" w:hAnsi="Arial"/>
+      <w:i w:val="0"/>
+      <w:iCs w:val="0"/>
+      <w:color w:val="292C30"/>
     </w:rPr>
   </w:style>
   <w:style w:type="paragraph" w:styleId="Heading8">
@@ -1137,8 +1591,9 @@
       <w:outlineLvl w:val="7"/>
     </w:pPr>
     <w:rPr>
-      <w:rFonts w:asciiTheme="majorHAnsi" w:eastAsiaTheme="majorEastAsia" w:hAnsiTheme="majorHAnsi" w:cstheme="majorBidi"/>
-      <w:color w:val="4F81BD" w:themeColor="accent1"/>
+      <w:rFonts w:asciiTheme="majorHAnsi" w:eastAsiaTheme="majorEastAsia" w:hAnsiTheme="majorHAnsi" w:cstheme="majorBidi" w:ascii="Arial" w:hAnsi="Arial"/>
+      <w:i w:val="0"/>
+      <w:color w:val="292C30"/>
       <w:sz w:val="20"/>
       <w:szCs w:val="20"/>
     </w:rPr>
@@ -1160,10 +1615,10 @@
       <w:outlineLvl w:val="8"/>
     </w:pPr>
     <w:rPr>
-      <w:rFonts w:asciiTheme="majorHAnsi" w:eastAsiaTheme="majorEastAsia" w:hAnsiTheme="majorHAnsi" w:cstheme="majorBidi"/>
-      <w:i/>
-      <w:iCs/>
-      <w:color w:val="404040" w:themeColor="text1" w:themeTint="BF"/>
+      <w:rFonts w:asciiTheme="majorHAnsi" w:eastAsiaTheme="majorEastAsia" w:hAnsiTheme="majorHAnsi" w:cstheme="majorBidi" w:ascii="Arial" w:hAnsi="Arial"/>
+      <w:i w:val="0"/>
+      <w:iCs w:val="0"/>
+      <w:color w:val="292C30"/>
       <w:sz w:val="20"/>
       <w:szCs w:val="20"/>
     </w:rPr>
@@ -1173,6 +1628,11 @@
     <w:uiPriority w:val="1"/>
     <w:semiHidden/>
     <w:unhideWhenUsed/>
+    <w:rPr>
+      <w:rFonts w:ascii="Arial" w:hAnsi="Arial"/>
+      <w:i w:val="0"/>
+      <w:color w:val="292C30"/>
+    </w:rPr>
   </w:style>
   <w:style w:type="table" w:default="1" w:styleId="TableNormal">
     <w:name w:val="Normal Table"/>
@@ -1203,6 +1663,11 @@
     <w:pPr>
       <w:spacing w:after="0" w:line="240" w:lineRule="auto"/>
     </w:pPr>
+    <w:rPr>
+      <w:rFonts w:ascii="Arial" w:hAnsi="Arial"/>
+      <w:i w:val="0"/>
+      <w:color w:val="292C30"/>
+    </w:rPr>
   </w:style>
   <w:style w:type="character" w:customStyle="1" w:styleId="Heading1Char">
     <w:name w:val="Heading 1 Char"/>
@@ -1211,10 +1676,11 @@
     <w:uiPriority w:val="9"/>
     <w:rsid w:val="00FC693F"/>
     <w:rPr>
-      <w:rFonts w:asciiTheme="majorHAnsi" w:eastAsiaTheme="majorEastAsia" w:hAnsiTheme="majorHAnsi" w:cstheme="majorBidi"/>
+      <w:rFonts w:asciiTheme="majorHAnsi" w:eastAsiaTheme="majorEastAsia" w:hAnsiTheme="majorHAnsi" w:cstheme="majorBidi" w:ascii="Arial" w:hAnsi="Arial"/>
       <w:b/>
       <w:bCs/>
-      <w:color w:val="365F91" w:themeColor="accent1" w:themeShade="BF"/>
+      <w:i w:val="0"/>
+      <w:color w:val="292C30"/>
       <w:sz w:val="28"/>
       <w:szCs w:val="28"/>
     </w:rPr>
@@ -1226,10 +1692,11 @@
     <w:uiPriority w:val="9"/>
     <w:rsid w:val="00FC693F"/>
     <w:rPr>
-      <w:rFonts w:asciiTheme="majorHAnsi" w:eastAsiaTheme="majorEastAsia" w:hAnsiTheme="majorHAnsi" w:cstheme="majorBidi"/>
+      <w:rFonts w:asciiTheme="majorHAnsi" w:eastAsiaTheme="majorEastAsia" w:hAnsiTheme="majorHAnsi" w:cstheme="majorBidi" w:ascii="Arial" w:hAnsi="Arial"/>
       <w:b/>
       <w:bCs/>
-      <w:color w:val="4F81BD" w:themeColor="accent1"/>
+      <w:i w:val="0"/>
+      <w:color w:val="292C30"/>
       <w:sz w:val="26"/>
       <w:szCs w:val="26"/>
     </w:rPr>
@@ -1241,10 +1708,11 @@
     <w:uiPriority w:val="9"/>
     <w:rsid w:val="00FC693F"/>
     <w:rPr>
-      <w:rFonts w:asciiTheme="majorHAnsi" w:eastAsiaTheme="majorEastAsia" w:hAnsiTheme="majorHAnsi" w:cstheme="majorBidi"/>
+      <w:rFonts w:asciiTheme="majorHAnsi" w:eastAsiaTheme="majorEastAsia" w:hAnsiTheme="majorHAnsi" w:cstheme="majorBidi" w:ascii="Arial" w:hAnsi="Arial"/>
       <w:b/>
       <w:bCs/>
-      <w:color w:val="4F81BD" w:themeColor="accent1"/>
+      <w:i w:val="0"/>
+      <w:color w:val="292C30"/>
     </w:rPr>
   </w:style>
   <w:style w:type="paragraph" w:styleId="Title">
@@ -1256,18 +1724,17 @@
     <w:qFormat/>
     <w:rsid w:val="00FC693F"/>
     <w:pPr>
-      <w:pBdr>
-        <w:bottom w:val="single" w:sz="8" w:space="4" w:color="4F81BD" w:themeColor="accent1"/>
-      </w:pBdr>
-      <w:spacing w:after="300" w:line="240" w:lineRule="auto"/>
+      <w:spacing w:after="100" w:line="240" w:lineRule="auto" w:before="140"/>
       <w:contextualSpacing/>
     </w:pPr>
     <w:rPr>
-      <w:rFonts w:asciiTheme="majorHAnsi" w:eastAsiaTheme="majorEastAsia" w:hAnsiTheme="majorHAnsi" w:cstheme="majorBidi"/>
-      <w:color w:val="17365D" w:themeColor="text2" w:themeShade="BF"/>
+      <w:rFonts w:asciiTheme="majorHAnsi" w:eastAsiaTheme="majorEastAsia" w:hAnsiTheme="majorHAnsi" w:cstheme="majorBidi" w:ascii="Arial" w:hAnsi="Arial"/>
+      <w:b/>
+      <w:i w:val="0"/>
+      <w:color w:val="292C30"/>
       <w:spacing w:val="5"/>
       <w:kern w:val="28"/>
-      <w:sz w:val="52"/>
+      <w:sz w:val="34"/>
       <w:szCs w:val="52"/>
     </w:rPr>
   </w:style>
@@ -1278,8 +1745,9 @@
     <w:uiPriority w:val="10"/>
     <w:rsid w:val="00FC693F"/>
     <w:rPr>
-      <w:rFonts w:asciiTheme="majorHAnsi" w:eastAsiaTheme="majorEastAsia" w:hAnsiTheme="majorHAnsi" w:cstheme="majorBidi"/>
-      <w:color w:val="17365D" w:themeColor="text2" w:themeShade="BF"/>
+      <w:rFonts w:asciiTheme="majorHAnsi" w:eastAsiaTheme="majorEastAsia" w:hAnsiTheme="majorHAnsi" w:cstheme="majorBidi" w:ascii="Arial" w:hAnsi="Arial"/>
+      <w:i w:val="0"/>
+      <w:color w:val="292C30"/>
       <w:spacing w:val="5"/>
       <w:kern w:val="28"/>
       <w:sz w:val="52"/>
@@ -1300,10 +1768,10 @@
       </w:numPr>
     </w:pPr>
     <w:rPr>
-      <w:rFonts w:asciiTheme="majorHAnsi" w:eastAsiaTheme="majorEastAsia" w:hAnsiTheme="majorHAnsi" w:cstheme="majorBidi"/>
-      <w:i/>
-      <w:iCs/>
-      <w:color w:val="4F81BD" w:themeColor="accent1"/>
+      <w:rFonts w:asciiTheme="majorHAnsi" w:eastAsiaTheme="majorEastAsia" w:hAnsiTheme="majorHAnsi" w:cstheme="majorBidi" w:ascii="Arial" w:hAnsi="Arial"/>
+      <w:i w:val="0"/>
+      <w:iCs w:val="0"/>
+      <w:color w:val="292C30"/>
       <w:spacing w:val="15"/>
       <w:sz w:val="24"/>
       <w:szCs w:val="24"/>
@@ -1316,10 +1784,10 @@
     <w:uiPriority w:val="11"/>
     <w:rsid w:val="00FC693F"/>
     <w:rPr>
-      <w:rFonts w:asciiTheme="majorHAnsi" w:eastAsiaTheme="majorEastAsia" w:hAnsiTheme="majorHAnsi" w:cstheme="majorBidi"/>
-      <w:i/>
-      <w:iCs/>
-      <w:color w:val="4F81BD" w:themeColor="accent1"/>
+      <w:rFonts w:asciiTheme="majorHAnsi" w:eastAsiaTheme="majorEastAsia" w:hAnsiTheme="majorHAnsi" w:cstheme="majorBidi" w:ascii="Arial" w:hAnsi="Arial"/>
+      <w:i w:val="0"/>
+      <w:iCs w:val="0"/>
+      <w:color w:val="292C30"/>
       <w:spacing w:val="15"/>
       <w:sz w:val="24"/>
       <w:szCs w:val="24"/>
@@ -1335,6 +1803,11 @@
       <w:ind w:left="720"/>
       <w:contextualSpacing/>
     </w:pPr>
+    <w:rPr>
+      <w:rFonts w:ascii="Arial" w:hAnsi="Arial"/>
+      <w:i w:val="0"/>
+      <w:color w:val="292C30"/>
+    </w:rPr>
   </w:style>
   <w:style w:type="paragraph" w:styleId="BodyText">
     <w:name w:val="Body Text"/>
@@ -1346,6 +1819,11 @@
     <w:pPr>
       <w:spacing w:after="120"/>
     </w:pPr>
+    <w:rPr>
+      <w:rFonts w:ascii="Arial" w:hAnsi="Arial"/>
+      <w:i w:val="0"/>
+      <w:color w:val="292C30"/>
+    </w:rPr>
   </w:style>
   <w:style w:type="character" w:customStyle="1" w:styleId="BodyTextChar">
     <w:name w:val="Body Text Char"/>
@@ -1353,6 +1831,11 @@
     <w:link w:val="BodyText"/>
     <w:uiPriority w:val="99"/>
     <w:rsid w:val="00AA1D8D"/>
+    <w:rPr>
+      <w:rFonts w:ascii="Arial" w:hAnsi="Arial"/>
+      <w:i w:val="0"/>
+      <w:color w:val="292C30"/>
+    </w:rPr>
   </w:style>
   <w:style w:type="paragraph" w:styleId="BodyText2">
     <w:name w:val="Body Text 2"/>
@@ -1364,6 +1847,11 @@
     <w:pPr>
       <w:spacing w:after="120" w:line="480" w:lineRule="auto"/>
     </w:pPr>
+    <w:rPr>
+      <w:rFonts w:ascii="Arial" w:hAnsi="Arial"/>
+      <w:i w:val="0"/>
+      <w:color w:val="292C30"/>
+    </w:rPr>
   </w:style>
   <w:style w:type="character" w:customStyle="1" w:styleId="BodyText2Char">
     <w:name w:val="Body Text 2 Char"/>
@@ -1371,6 +1859,11 @@
     <w:link w:val="BodyText2"/>
     <w:uiPriority w:val="99"/>
     <w:rsid w:val="00AA1D8D"/>
+    <w:rPr>
+      <w:rFonts w:ascii="Arial" w:hAnsi="Arial"/>
+      <w:i w:val="0"/>
+      <w:color w:val="292C30"/>
+    </w:rPr>
   </w:style>
   <w:style w:type="paragraph" w:styleId="BodyText3">
     <w:name w:val="Body Text 3"/>
@@ -1383,6 +1876,9 @@
       <w:spacing w:after="120"/>
     </w:pPr>
     <w:rPr>
+      <w:rFonts w:ascii="Arial" w:hAnsi="Arial"/>
+      <w:i w:val="0"/>
+      <w:color w:val="292C30"/>
       <w:sz w:val="16"/>
       <w:szCs w:val="16"/>
     </w:rPr>
@@ -1394,6 +1890,9 @@
     <w:uiPriority w:val="99"/>
     <w:rsid w:val="00AA1D8D"/>
     <w:rPr>
+      <w:rFonts w:ascii="Arial" w:hAnsi="Arial"/>
+      <w:i w:val="0"/>
+      <w:color w:val="292C30"/>
       <w:sz w:val="16"/>
       <w:szCs w:val="16"/>
     </w:rPr>
@@ -1408,6 +1907,11 @@
       <w:ind w:left="360" w:hanging="360"/>
       <w:contextualSpacing/>
     </w:pPr>
+    <w:rPr>
+      <w:rFonts w:ascii="Arial" w:hAnsi="Arial"/>
+      <w:i w:val="0"/>
+      <w:color w:val="292C30"/>
+    </w:rPr>
   </w:style>
   <w:style w:type="paragraph" w:styleId="List2">
     <w:name w:val="List 2"/>
@@ -1419,6 +1923,11 @@
       <w:ind w:left="720" w:hanging="360"/>
       <w:contextualSpacing/>
     </w:pPr>
+    <w:rPr>
+      <w:rFonts w:ascii="Arial" w:hAnsi="Arial"/>
+      <w:i w:val="0"/>
+      <w:color w:val="292C30"/>
+    </w:rPr>
   </w:style>
   <w:style w:type="paragraph" w:styleId="List3">
     <w:name w:val="List 3"/>
@@ -1430,6 +1939,11 @@
       <w:ind w:left="1080" w:hanging="360"/>
       <w:contextualSpacing/>
     </w:pPr>
+    <w:rPr>
+      <w:rFonts w:ascii="Arial" w:hAnsi="Arial"/>
+      <w:i w:val="0"/>
+      <w:color w:val="292C30"/>
+    </w:rPr>
   </w:style>
   <w:style w:type="paragraph" w:styleId="ListBullet">
     <w:name w:val="List Bullet"/>
@@ -1443,6 +1957,11 @@
       </w:numPr>
       <w:contextualSpacing/>
     </w:pPr>
+    <w:rPr>
+      <w:rFonts w:ascii="Arial" w:hAnsi="Arial"/>
+      <w:i w:val="0"/>
+      <w:color w:val="292C30"/>
+    </w:rPr>
   </w:style>
   <w:style w:type="paragraph" w:styleId="ListBullet2">
     <w:name w:val="List Bullet 2"/>
@@ -1456,6 +1975,11 @@
       </w:numPr>
       <w:contextualSpacing/>
     </w:pPr>
+    <w:rPr>
+      <w:rFonts w:ascii="Arial" w:hAnsi="Arial"/>
+      <w:i w:val="0"/>
+      <w:color w:val="292C30"/>
+    </w:rPr>
   </w:style>
   <w:style w:type="paragraph" w:styleId="ListBullet3">
     <w:name w:val="List Bullet 3"/>
@@ -1469,6 +1993,11 @@
       </w:numPr>
       <w:contextualSpacing/>
     </w:pPr>
+    <w:rPr>
+      <w:rFonts w:ascii="Arial" w:hAnsi="Arial"/>
+      <w:i w:val="0"/>
+      <w:color w:val="292C30"/>
+    </w:rPr>
   </w:style>
   <w:style w:type="paragraph" w:styleId="ListNumber">
     <w:name w:val="List Number"/>
@@ -1482,6 +2011,11 @@
       </w:numPr>
       <w:contextualSpacing/>
     </w:pPr>
+    <w:rPr>
+      <w:rFonts w:ascii="Arial" w:hAnsi="Arial"/>
+      <w:i w:val="0"/>
+      <w:color w:val="292C30"/>
+    </w:rPr>
   </w:style>
   <w:style w:type="paragraph" w:styleId="ListNumber2">
     <w:name w:val="List Number 2"/>
@@ -1495,6 +2029,11 @@
       </w:numPr>
       <w:contextualSpacing/>
     </w:pPr>
+    <w:rPr>
+      <w:rFonts w:ascii="Arial" w:hAnsi="Arial"/>
+      <w:i w:val="0"/>
+      <w:color w:val="292C30"/>
+    </w:rPr>
   </w:style>
   <w:style w:type="paragraph" w:styleId="ListNumber3">
     <w:name w:val="List Number 3"/>
@@ -1508,6 +2047,11 @@
       </w:numPr>
       <w:contextualSpacing/>
     </w:pPr>
+    <w:rPr>
+      <w:rFonts w:ascii="Arial" w:hAnsi="Arial"/>
+      <w:i w:val="0"/>
+      <w:color w:val="292C30"/>
+    </w:rPr>
   </w:style>
   <w:style w:type="paragraph" w:styleId="ListContinue">
     <w:name w:val="List Continue"/>
@@ -1520,6 +2064,11 @@
       <w:ind w:left="360"/>
       <w:contextualSpacing/>
     </w:pPr>
+    <w:rPr>
+      <w:rFonts w:ascii="Arial" w:hAnsi="Arial"/>
+      <w:i w:val="0"/>
+      <w:color w:val="292C30"/>
+    </w:rPr>
   </w:style>
   <w:style w:type="paragraph" w:styleId="ListContinue2">
     <w:name w:val="List Continue 2"/>
@@ -1532,6 +2081,11 @@
       <w:ind w:left="720"/>
       <w:contextualSpacing/>
     </w:pPr>
+    <w:rPr>
+      <w:rFonts w:ascii="Arial" w:hAnsi="Arial"/>
+      <w:i w:val="0"/>
+      <w:color w:val="292C30"/>
+    </w:rPr>
   </w:style>
   <w:style w:type="paragraph" w:styleId="ListContinue3">
     <w:name w:val="List Continue 3"/>
@@ -1544,6 +2098,11 @@
       <w:ind w:left="1080"/>
       <w:contextualSpacing/>
     </w:pPr>
+    <w:rPr>
+      <w:rFonts w:ascii="Arial" w:hAnsi="Arial"/>
+      <w:i w:val="0"/>
+      <w:color w:val="292C30"/>
+    </w:rPr>
   </w:style>
   <w:style w:type="paragraph" w:styleId="MacroText">
     <w:name w:val="macro"/>
@@ -1563,7 +2122,9 @@
       </w:tabs>
     </w:pPr>
     <w:rPr>
-      <w:rFonts w:ascii="Courier" w:hAnsi="Courier"/>
+      <w:rFonts w:ascii="Arial" w:hAnsi="Arial"/>
+      <w:i w:val="0"/>
+      <w:color w:val="292C30"/>
       <w:sz w:val="20"/>
       <w:szCs w:val="20"/>
     </w:rPr>
@@ -1575,7 +2136,9 @@
     <w:uiPriority w:val="99"/>
     <w:rsid w:val="0029639D"/>
     <w:rPr>
-      <w:rFonts w:ascii="Courier" w:hAnsi="Courier"/>
+      <w:rFonts w:ascii="Arial" w:hAnsi="Arial"/>
+      <w:i w:val="0"/>
+      <w:color w:val="292C30"/>
       <w:sz w:val="20"/>
       <w:szCs w:val="20"/>
     </w:rPr>
@@ -1589,9 +2152,10 @@
     <w:qFormat/>
     <w:rsid w:val="00FC693F"/>
     <w:rPr>
-      <w:i/>
-      <w:iCs/>
-      <w:color w:val="000000" w:themeColor="text1"/>
+      <w:rFonts w:ascii="Arial" w:hAnsi="Arial"/>
+      <w:i w:val="0"/>
+      <w:iCs w:val="0"/>
+      <w:color w:val="292C30"/>
     </w:rPr>
   </w:style>
   <w:style w:type="character" w:customStyle="1" w:styleId="QuoteChar">
@@ -1601,9 +2165,10 @@
     <w:uiPriority w:val="29"/>
     <w:rsid w:val="00FC693F"/>
     <w:rPr>
-      <w:i/>
-      <w:iCs/>
-      <w:color w:val="000000" w:themeColor="text1"/>
+      <w:rFonts w:ascii="Arial" w:hAnsi="Arial"/>
+      <w:i w:val="0"/>
+      <w:iCs w:val="0"/>
+      <w:color w:val="292C30"/>
     </w:rPr>
   </w:style>
   <w:style w:type="character" w:customStyle="1" w:styleId="Heading4Char">
@@ -1614,12 +2179,12 @@
     <w:semiHidden/>
     <w:rsid w:val="00FC693F"/>
     <w:rPr>
-      <w:rFonts w:asciiTheme="majorHAnsi" w:eastAsiaTheme="majorEastAsia" w:hAnsiTheme="majorHAnsi" w:cstheme="majorBidi"/>
+      <w:rFonts w:asciiTheme="majorHAnsi" w:eastAsiaTheme="majorEastAsia" w:hAnsiTheme="majorHAnsi" w:cstheme="majorBidi" w:ascii="Arial" w:hAnsi="Arial"/>
       <w:b/>
       <w:bCs/>
-      <w:i/>
-      <w:iCs/>
-      <w:color w:val="4F81BD" w:themeColor="accent1"/>
+      <w:i w:val="0"/>
+      <w:iCs w:val="0"/>
+      <w:color w:val="292C30"/>
     </w:rPr>
   </w:style>
   <w:style w:type="character" w:customStyle="1" w:styleId="Heading5Char">
@@ -1630,8 +2195,9 @@
     <w:semiHidden/>
     <w:rsid w:val="00FC693F"/>
     <w:rPr>
-      <w:rFonts w:asciiTheme="majorHAnsi" w:eastAsiaTheme="majorEastAsia" w:hAnsiTheme="majorHAnsi" w:cstheme="majorBidi"/>
-      <w:color w:val="243F60" w:themeColor="accent1" w:themeShade="7F"/>
+      <w:rFonts w:asciiTheme="majorHAnsi" w:eastAsiaTheme="majorEastAsia" w:hAnsiTheme="majorHAnsi" w:cstheme="majorBidi" w:ascii="Arial" w:hAnsi="Arial"/>
+      <w:i w:val="0"/>
+      <w:color w:val="292C30"/>
     </w:rPr>
   </w:style>
   <w:style w:type="character" w:customStyle="1" w:styleId="Heading6Char">
@@ -1642,10 +2208,10 @@
     <w:semiHidden/>
     <w:rsid w:val="00FC693F"/>
     <w:rPr>
-      <w:rFonts w:asciiTheme="majorHAnsi" w:eastAsiaTheme="majorEastAsia" w:hAnsiTheme="majorHAnsi" w:cstheme="majorBidi"/>
-      <w:i/>
-      <w:iCs/>
-      <w:color w:val="243F60" w:themeColor="accent1" w:themeShade="7F"/>
+      <w:rFonts w:asciiTheme="majorHAnsi" w:eastAsiaTheme="majorEastAsia" w:hAnsiTheme="majorHAnsi" w:cstheme="majorBidi" w:ascii="Arial" w:hAnsi="Arial"/>
+      <w:i w:val="0"/>
+      <w:iCs w:val="0"/>
+      <w:color w:val="292C30"/>
     </w:rPr>
   </w:style>
   <w:style w:type="character" w:customStyle="1" w:styleId="Heading7Char">
@@ -1656,10 +2222,10 @@
     <w:semiHidden/>
     <w:rsid w:val="00FC693F"/>
     <w:rPr>
-      <w:rFonts w:asciiTheme="majorHAnsi" w:eastAsiaTheme="majorEastAsia" w:hAnsiTheme="majorHAnsi" w:cstheme="majorBidi"/>
-      <w:i/>
-      <w:iCs/>
-      <w:color w:val="404040" w:themeColor="text1" w:themeTint="BF"/>
+      <w:rFonts w:asciiTheme="majorHAnsi" w:eastAsiaTheme="majorEastAsia" w:hAnsiTheme="majorHAnsi" w:cstheme="majorBidi" w:ascii="Arial" w:hAnsi="Arial"/>
+      <w:i w:val="0"/>
+      <w:iCs w:val="0"/>
+      <w:color w:val="292C30"/>
     </w:rPr>
   </w:style>
   <w:style w:type="character" w:customStyle="1" w:styleId="Heading8Char">
@@ -1670,8 +2236,9 @@
     <w:semiHidden/>
     <w:rsid w:val="00FC693F"/>
     <w:rPr>
-      <w:rFonts w:asciiTheme="majorHAnsi" w:eastAsiaTheme="majorEastAsia" w:hAnsiTheme="majorHAnsi" w:cstheme="majorBidi"/>
-      <w:color w:val="4F81BD" w:themeColor="accent1"/>
+      <w:rFonts w:asciiTheme="majorHAnsi" w:eastAsiaTheme="majorEastAsia" w:hAnsiTheme="majorHAnsi" w:cstheme="majorBidi" w:ascii="Arial" w:hAnsi="Arial"/>
+      <w:i w:val="0"/>
+      <w:color w:val="292C30"/>
       <w:sz w:val="20"/>
       <w:szCs w:val="20"/>
     </w:rPr>
@@ -1684,10 +2251,10 @@
     <w:semiHidden/>
     <w:rsid w:val="00FC693F"/>
     <w:rPr>
-      <w:rFonts w:asciiTheme="majorHAnsi" w:eastAsiaTheme="majorEastAsia" w:hAnsiTheme="majorHAnsi" w:cstheme="majorBidi"/>
-      <w:i/>
-      <w:iCs/>
-      <w:color w:val="404040" w:themeColor="text1" w:themeTint="BF"/>
+      <w:rFonts w:asciiTheme="majorHAnsi" w:eastAsiaTheme="majorEastAsia" w:hAnsiTheme="majorHAnsi" w:cstheme="majorBidi" w:ascii="Arial" w:hAnsi="Arial"/>
+      <w:i w:val="0"/>
+      <w:iCs w:val="0"/>
+      <w:color w:val="292C30"/>
       <w:sz w:val="20"/>
       <w:szCs w:val="20"/>
     </w:rPr>
@@ -1705,9 +2272,11 @@
       <w:spacing w:line="240" w:lineRule="auto"/>
     </w:pPr>
     <w:rPr>
+      <w:rFonts w:ascii="Arial" w:hAnsi="Arial"/>
       <w:b/>
       <w:bCs/>
-      <w:color w:val="4F81BD" w:themeColor="accent1"/>
+      <w:i w:val="0"/>
+      <w:color w:val="292C30"/>
       <w:sz w:val="18"/>
       <w:szCs w:val="18"/>
     </w:rPr>
@@ -1719,8 +2288,11 @@
     <w:qFormat/>
     <w:rsid w:val="00FC693F"/>
     <w:rPr>
+      <w:rFonts w:ascii="Arial" w:hAnsi="Arial"/>
       <w:b/>
       <w:bCs/>
+      <w:i w:val="0"/>
+      <w:color w:val="292C30"/>
     </w:rPr>
   </w:style>
   <w:style w:type="character" w:styleId="Emphasis">
@@ -1730,8 +2302,10 @@
     <w:qFormat/>
     <w:rsid w:val="00FC693F"/>
     <w:rPr>
-      <w:i/>
-      <w:iCs/>
+      <w:rFonts w:ascii="Arial" w:hAnsi="Arial"/>
+      <w:i w:val="0"/>
+      <w:iCs w:val="0"/>
+      <w:color w:val="292C30"/>
     </w:rPr>
   </w:style>
   <w:style w:type="paragraph" w:styleId="IntenseQuote">
@@ -1743,18 +2317,16 @@
     <w:qFormat/>
     <w:rsid w:val="00FC693F"/>
     <w:pPr>
-      <w:pBdr>
-        <w:bottom w:val="single" w:sz="4" w:space="4" w:color="4F81BD" w:themeColor="accent1"/>
-      </w:pBdr>
       <w:spacing w:before="200" w:after="280"/>
       <w:ind w:left="936" w:right="936"/>
     </w:pPr>
     <w:rPr>
+      <w:rFonts w:ascii="Arial" w:hAnsi="Arial"/>
       <w:b/>
       <w:bCs/>
-      <w:i/>
-      <w:iCs/>
-      <w:color w:val="4F81BD" w:themeColor="accent1"/>
+      <w:i w:val="0"/>
+      <w:iCs w:val="0"/>
+      <w:color w:val="292C30"/>
     </w:rPr>
   </w:style>
   <w:style w:type="character" w:customStyle="1" w:styleId="IntenseQuoteChar">
@@ -1764,11 +2336,12 @@
     <w:uiPriority w:val="30"/>
     <w:rsid w:val="00FC693F"/>
     <w:rPr>
+      <w:rFonts w:ascii="Arial" w:hAnsi="Arial"/>
       <w:b/>
       <w:bCs/>
-      <w:i/>
-      <w:iCs/>
-      <w:color w:val="4F81BD" w:themeColor="accent1"/>
+      <w:i w:val="0"/>
+      <w:iCs w:val="0"/>
+      <w:color w:val="292C30"/>
     </w:rPr>
   </w:style>
   <w:style w:type="character" w:styleId="SubtleEmphasis">
@@ -1778,9 +2351,10 @@
     <w:qFormat/>
     <w:rsid w:val="00FC693F"/>
     <w:rPr>
-      <w:i/>
-      <w:iCs/>
-      <w:color w:val="808080" w:themeColor="text1" w:themeTint="7F"/>
+      <w:rFonts w:ascii="Arial" w:hAnsi="Arial"/>
+      <w:i w:val="0"/>
+      <w:iCs w:val="0"/>
+      <w:color w:val="292C30"/>
     </w:rPr>
   </w:style>
   <w:style w:type="character" w:styleId="IntenseEmphasis">
@@ -1790,11 +2364,12 @@
     <w:qFormat/>
     <w:rsid w:val="00FC693F"/>
     <w:rPr>
+      <w:rFonts w:ascii="Arial" w:hAnsi="Arial"/>
       <w:b/>
       <w:bCs/>
-      <w:i/>
-      <w:iCs/>
-      <w:color w:val="4F81BD" w:themeColor="accent1"/>
+      <w:i w:val="0"/>
+      <w:iCs w:val="0"/>
+      <w:color w:val="292C30"/>
     </w:rPr>
   </w:style>
   <w:style w:type="character" w:styleId="SubtleReference">
@@ -1804,8 +2379,10 @@
     <w:qFormat/>
     <w:rsid w:val="00FC693F"/>
     <w:rPr>
+      <w:rFonts w:ascii="Arial" w:hAnsi="Arial"/>
+      <w:i w:val="0"/>
       <w:smallCaps/>
-      <w:color w:val="C0504D" w:themeColor="accent2"/>
+      <w:color w:val="292C30"/>
       <w:u w:val="single"/>
     </w:rPr>
   </w:style>
@@ -1816,10 +2393,12 @@
     <w:qFormat/>
     <w:rsid w:val="00FC693F"/>
     <w:rPr>
+      <w:rFonts w:ascii="Arial" w:hAnsi="Arial"/>
       <w:b/>
       <w:bCs/>
+      <w:i w:val="0"/>
       <w:smallCaps/>
-      <w:color w:val="C0504D" w:themeColor="accent2"/>
+      <w:color w:val="292C30"/>
       <w:spacing w:val="5"/>
       <w:u w:val="single"/>
     </w:rPr>
@@ -1831,9 +2410,12 @@
     <w:qFormat/>
     <w:rsid w:val="00FC693F"/>
     <w:rPr>
+      <w:rFonts w:ascii="Arial" w:hAnsi="Arial"/>
       <w:b/>
       <w:bCs/>
+      <w:i w:val="0"/>
       <w:smallCaps/>
+      <w:color w:val="292C30"/>
       <w:spacing w:val="5"/>
     </w:rPr>
   </w:style>
@@ -1849,6 +2431,11 @@
     <w:pPr>
       <w:outlineLvl w:val="9"/>
     </w:pPr>
+    <w:rPr>
+      <w:rFonts w:ascii="Arial" w:hAnsi="Arial"/>
+      <w:i w:val="0"/>
+      <w:color w:val="292C30"/>
+    </w:rPr>
   </w:style>
   <w:style w:type="table" w:styleId="TableGrid">
     <w:name w:val="Table Grid"/>
@@ -12850,8 +13437,8 @@
       <w:rFonts w:asciiTheme="majorHAnsi" w:eastAsiaTheme="majorEastAsia" w:hAnsiTheme="majorHAnsi" w:cstheme="majorBidi"/>
       <w:b/>
       <w:bCs/>
-      <w:i/>
-      <w:iCs/>
+      <w:i w:val="0"/>
+      <w:iCs w:val="0"/>
       <w:color w:val="4F81BD" w:themeColor="accent1"/>
     </w:rPr>
   </w:style>
@@ -12894,8 +13481,8 @@
     </w:pPr>
     <w:rPr>
       <w:rFonts w:asciiTheme="majorHAnsi" w:eastAsiaTheme="majorEastAsia" w:hAnsiTheme="majorHAnsi" w:cstheme="majorBidi"/>
-      <w:i/>
-      <w:iCs/>
+      <w:i w:val="0"/>
+      <w:iCs w:val="0"/>
       <w:color w:val="243F60" w:themeColor="accent1" w:themeShade="7F"/>
     </w:rPr>
   </w:style>
@@ -12917,8 +13504,8 @@
     </w:pPr>
     <w:rPr>
       <w:rFonts w:asciiTheme="majorHAnsi" w:eastAsiaTheme="majorEastAsia" w:hAnsiTheme="majorHAnsi" w:cstheme="majorBidi"/>
-      <w:i/>
-      <w:iCs/>
+      <w:i w:val="0"/>
+      <w:iCs w:val="0"/>
       <w:color w:val="404040" w:themeColor="text1" w:themeTint="BF"/>
     </w:rPr>
   </w:style>
@@ -12963,8 +13550,8 @@
     </w:pPr>
     <w:rPr>
       <w:rFonts w:asciiTheme="majorHAnsi" w:eastAsiaTheme="majorEastAsia" w:hAnsiTheme="majorHAnsi" w:cstheme="majorBidi"/>
-      <w:i/>
-      <w:iCs/>
+      <w:i w:val="0"/>
+      <w:iCs w:val="0"/>
       <w:color w:val="404040" w:themeColor="text1" w:themeTint="BF"/>
       <w:sz w:val="20"/>
       <w:szCs w:val="20"/>
@@ -13103,8 +13690,8 @@
     </w:pPr>
     <w:rPr>
       <w:rFonts w:asciiTheme="majorHAnsi" w:eastAsiaTheme="majorEastAsia" w:hAnsiTheme="majorHAnsi" w:cstheme="majorBidi"/>
-      <w:i/>
-      <w:iCs/>
+      <w:i w:val="0"/>
+      <w:iCs w:val="0"/>
       <w:color w:val="4F81BD" w:themeColor="accent1"/>
       <w:spacing w:val="15"/>
       <w:sz w:val="24"/>
@@ -13119,8 +13706,8 @@
     <w:rsid w:val="00FC693F"/>
     <w:rPr>
       <w:rFonts w:asciiTheme="majorHAnsi" w:eastAsiaTheme="majorEastAsia" w:hAnsiTheme="majorHAnsi" w:cstheme="majorBidi"/>
-      <w:i/>
-      <w:iCs/>
+      <w:i w:val="0"/>
+      <w:iCs w:val="0"/>
       <w:color w:val="4F81BD" w:themeColor="accent1"/>
       <w:spacing w:val="15"/>
       <w:sz w:val="24"/>
@@ -13391,8 +13978,8 @@
     <w:qFormat/>
     <w:rsid w:val="00FC693F"/>
     <w:rPr>
-      <w:i/>
-      <w:iCs/>
+      <w:i w:val="0"/>
+      <w:iCs w:val="0"/>
       <w:color w:val="000000" w:themeColor="text1"/>
     </w:rPr>
   </w:style>
@@ -13403,8 +13990,8 @@
     <w:uiPriority w:val="29"/>
     <w:rsid w:val="00FC693F"/>
     <w:rPr>
-      <w:i/>
-      <w:iCs/>
+      <w:i w:val="0"/>
+      <w:iCs w:val="0"/>
       <w:color w:val="000000" w:themeColor="text1"/>
     </w:rPr>
   </w:style>
@@ -13419,8 +14006,8 @@
       <w:rFonts w:asciiTheme="majorHAnsi" w:eastAsiaTheme="majorEastAsia" w:hAnsiTheme="majorHAnsi" w:cstheme="majorBidi"/>
       <w:b/>
       <w:bCs/>
-      <w:i/>
-      <w:iCs/>
+      <w:i w:val="0"/>
+      <w:iCs w:val="0"/>
       <w:color w:val="4F81BD" w:themeColor="accent1"/>
     </w:rPr>
   </w:style>
@@ -13445,8 +14032,8 @@
     <w:rsid w:val="00FC693F"/>
     <w:rPr>
       <w:rFonts w:asciiTheme="majorHAnsi" w:eastAsiaTheme="majorEastAsia" w:hAnsiTheme="majorHAnsi" w:cstheme="majorBidi"/>
-      <w:i/>
-      <w:iCs/>
+      <w:i w:val="0"/>
+      <w:iCs w:val="0"/>
       <w:color w:val="243F60" w:themeColor="accent1" w:themeShade="7F"/>
     </w:rPr>
   </w:style>
@@ -13459,8 +14046,8 @@
     <w:rsid w:val="00FC693F"/>
     <w:rPr>
       <w:rFonts w:asciiTheme="majorHAnsi" w:eastAsiaTheme="majorEastAsia" w:hAnsiTheme="majorHAnsi" w:cstheme="majorBidi"/>
-      <w:i/>
-      <w:iCs/>
+      <w:i w:val="0"/>
+      <w:iCs w:val="0"/>
       <w:color w:val="404040" w:themeColor="text1" w:themeTint="BF"/>
     </w:rPr>
   </w:style>
@@ -13487,8 +14074,8 @@
     <w:rsid w:val="00FC693F"/>
     <w:rPr>
       <w:rFonts w:asciiTheme="majorHAnsi" w:eastAsiaTheme="majorEastAsia" w:hAnsiTheme="majorHAnsi" w:cstheme="majorBidi"/>
-      <w:i/>
-      <w:iCs/>
+      <w:i w:val="0"/>
+      <w:iCs w:val="0"/>
       <w:color w:val="404040" w:themeColor="text1" w:themeTint="BF"/>
       <w:sz w:val="20"/>
       <w:szCs w:val="20"/>
@@ -13532,8 +14119,8 @@
     <w:qFormat/>
     <w:rsid w:val="00FC693F"/>
     <w:rPr>
-      <w:i/>
-      <w:iCs/>
+      <w:i w:val="0"/>
+      <w:iCs w:val="0"/>
     </w:rPr>
   </w:style>
   <w:style w:type="paragraph" w:styleId="IntenseQuote">
@@ -13554,8 +14141,8 @@
     <w:rPr>
       <w:b/>
       <w:bCs/>
-      <w:i/>
-      <w:iCs/>
+      <w:i w:val="0"/>
+      <w:iCs w:val="0"/>
       <w:color w:val="4F81BD" w:themeColor="accent1"/>
     </w:rPr>
   </w:style>
@@ -13568,8 +14155,8 @@
     <w:rPr>
       <w:b/>
       <w:bCs/>
-      <w:i/>
-      <w:iCs/>
+      <w:i w:val="0"/>
+      <w:iCs w:val="0"/>
       <w:color w:val="4F81BD" w:themeColor="accent1"/>
     </w:rPr>
   </w:style>
@@ -13580,8 +14167,8 @@
     <w:qFormat/>
     <w:rsid w:val="00FC693F"/>
     <w:rPr>
-      <w:i/>
-      <w:iCs/>
+      <w:i w:val="0"/>
+      <w:iCs w:val="0"/>
       <w:color w:val="808080" w:themeColor="text1" w:themeTint="7F"/>
     </w:rPr>
   </w:style>
@@ -13594,8 +14181,8 @@
     <w:rPr>
       <w:b/>
       <w:bCs/>
-      <w:i/>
-      <w:iCs/>
+      <w:i w:val="0"/>
+      <w:iCs w:val="0"/>
       <w:color w:val="4F81BD" w:themeColor="accent1"/>
     </w:rPr>
   </w:style>

</xml_diff>